<commit_message>
ui and product corrections
</commit_message>
<xml_diff>
--- a/project_desc/details.docx
+++ b/project_desc/details.docx
@@ -151,7 +151,15 @@
         <w:t xml:space="preserve">employee code should be auto generated like </w:t>
       </w:r>
       <w:r>
-        <w:t>“TCV”+1 (with prefix)</w:t>
+        <w:t>“</w:t>
+      </w:r>
+      <w:proofErr w:type="gramStart"/>
+      <w:r>
+        <w:t>TCV”+</w:t>
+      </w:r>
+      <w:proofErr w:type="gramEnd"/>
+      <w:r>
+        <w:t>1 (with prefix)</w:t>
       </w:r>
       <w:r>
         <w:t>;</w:t>
@@ -302,7 +310,15 @@
         </w:numPr>
       </w:pPr>
       <w:r>
-        <w:t xml:space="preserve">photo should uploaded in jpeg, jpg, </w:t>
+        <w:t xml:space="preserve">photo should </w:t>
+      </w:r>
+      <w:proofErr w:type="gramStart"/>
+      <w:r>
+        <w:t>uploaded</w:t>
+      </w:r>
+      <w:proofErr w:type="gramEnd"/>
+      <w:r>
+        <w:t xml:space="preserve"> in jpeg, jpg, </w:t>
       </w:r>
       <w:proofErr w:type="spellStart"/>
       <w:r>
@@ -334,7 +350,15 @@
         </w:numPr>
       </w:pPr>
       <w:r>
-        <w:t xml:space="preserve">if possible to fetch the employee </w:t>
+        <w:t xml:space="preserve">if </w:t>
+      </w:r>
+      <w:proofErr w:type="gramStart"/>
+      <w:r>
+        <w:t>possible</w:t>
+      </w:r>
+      <w:proofErr w:type="gramEnd"/>
+      <w:r>
+        <w:t xml:space="preserve"> to fetch the employee </w:t>
       </w:r>
       <w:r>
         <w:t xml:space="preserve">data from </w:t>
@@ -379,7 +403,23 @@
         </w:numPr>
       </w:pPr>
       <w:r>
-        <w:t>And List the all Indian acceptable proof name, in the dropdown to select</w:t>
+        <w:t xml:space="preserve">And </w:t>
+      </w:r>
+      <w:proofErr w:type="gramStart"/>
+      <w:r>
+        <w:t>List</w:t>
+      </w:r>
+      <w:proofErr w:type="gramEnd"/>
+      <w:r>
+        <w:t xml:space="preserve"> the </w:t>
+      </w:r>
+      <w:proofErr w:type="gramStart"/>
+      <w:r>
+        <w:t>all Indian</w:t>
+      </w:r>
+      <w:proofErr w:type="gramEnd"/>
+      <w:r>
+        <w:t xml:space="preserve"> acceptable proof name, in the dropdown to select</w:t>
       </w:r>
     </w:p>
     <w:p>
@@ -460,21 +500,36 @@
         <w:t xml:space="preserve">, </w:t>
       </w:r>
       <w:r>
-        <w:t xml:space="preserve">Date Of </w:t>
+        <w:t xml:space="preserve">Date </w:t>
+      </w:r>
+      <w:proofErr w:type="gramStart"/>
+      <w:r>
+        <w:t>Of</w:t>
+      </w:r>
+      <w:proofErr w:type="gramEnd"/>
+      <w:r>
+        <w:t xml:space="preserve"> </w:t>
       </w:r>
       <w:proofErr w:type="spellStart"/>
-      <w:r>
-        <w:t>Birth,Qualification,Spouse</w:t>
+      <w:proofErr w:type="gramStart"/>
+      <w:r>
+        <w:t>Birth,Qualification</w:t>
+      </w:r>
+      <w:proofErr w:type="gramEnd"/>
+      <w:r>
+        <w:t>,Spouse</w:t>
       </w:r>
       <w:proofErr w:type="spellEnd"/>
       <w:r>
         <w:t xml:space="preserve">/parent </w:t>
       </w:r>
       <w:proofErr w:type="spellStart"/>
+      <w:proofErr w:type="gramStart"/>
       <w:r>
         <w:t>Name,Id</w:t>
       </w:r>
       <w:proofErr w:type="spellEnd"/>
+      <w:proofErr w:type="gramEnd"/>
       <w:r>
         <w:t xml:space="preserve"> Proof Type, Id Proof Number</w:t>
       </w:r>
@@ -491,7 +546,15 @@
         </w:numPr>
       </w:pPr>
       <w:r>
-        <w:t xml:space="preserve">Temporary address are not mandatory </w:t>
+        <w:t xml:space="preserve">Temporary address </w:t>
+      </w:r>
+      <w:proofErr w:type="gramStart"/>
+      <w:r>
+        <w:t>are</w:t>
+      </w:r>
+      <w:proofErr w:type="gramEnd"/>
+      <w:r>
+        <w:t xml:space="preserve"> not mandatory </w:t>
       </w:r>
     </w:p>
     <w:p>
@@ -831,10 +894,18 @@
         <w:t xml:space="preserve">/ internet / </w:t>
       </w:r>
       <w:r>
-        <w:t>other extendable</w:t>
-      </w:r>
-      <w:r>
-        <w:t xml:space="preserve"> , should be selectable</w:t>
+        <w:t xml:space="preserve">other </w:t>
+      </w:r>
+      <w:proofErr w:type="gramStart"/>
+      <w:r>
+        <w:t>extendable</w:t>
+      </w:r>
+      <w:r>
+        <w:t xml:space="preserve"> ,</w:t>
+      </w:r>
+      <w:proofErr w:type="gramEnd"/>
+      <w:r>
+        <w:t xml:space="preserve"> should be selectable</w:t>
       </w:r>
     </w:p>
     <w:p>
@@ -872,7 +943,15 @@
         </w:numPr>
       </w:pPr>
       <w:r>
-        <w:t>Level 2 -  5MP</w:t>
+        <w:t xml:space="preserve">Level 2 </w:t>
+      </w:r>
+      <w:proofErr w:type="gramStart"/>
+      <w:r>
+        <w:t>-  5</w:t>
+      </w:r>
+      <w:proofErr w:type="gramEnd"/>
+      <w:r>
+        <w:t>MP</w:t>
       </w:r>
       <w:r>
         <w:t xml:space="preserve"> free text</w:t>
@@ -902,10 +981,18 @@
         </w:numPr>
       </w:pPr>
       <w:r>
-        <w:t xml:space="preserve">Level 4 – Night vision </w:t>
-      </w:r>
-      <w:r>
-        <w:t xml:space="preserve"> free text</w:t>
+        <w:t xml:space="preserve">Level 4 – Night </w:t>
+      </w:r>
+      <w:proofErr w:type="gramStart"/>
+      <w:r>
+        <w:t xml:space="preserve">vision </w:t>
+      </w:r>
+      <w:r>
+        <w:t xml:space="preserve"> free</w:t>
+      </w:r>
+      <w:proofErr w:type="gramEnd"/>
+      <w:r>
+        <w:t xml:space="preserve"> text</w:t>
       </w:r>
     </w:p>
     <w:p>
@@ -955,7 +1042,15 @@
         <w:ind w:left="720"/>
       </w:pPr>
       <w:r>
-        <w:t xml:space="preserve">9. Refer the table : </w:t>
+        <w:t xml:space="preserve">9. Refer the </w:t>
+      </w:r>
+      <w:proofErr w:type="gramStart"/>
+      <w:r>
+        <w:t>table :</w:t>
+      </w:r>
+      <w:proofErr w:type="gramEnd"/>
+      <w:r>
+        <w:t xml:space="preserve"> </w:t>
       </w:r>
       <w:r>
         <w:t>categories</w:t>
@@ -1016,8 +1111,13 @@
       </w:r>
       <w:proofErr w:type="spellEnd"/>
       <w:r>
-        <w:t xml:space="preserve"> =[</w:t>
-      </w:r>
+        <w:t xml:space="preserve"> </w:t>
+      </w:r>
+      <w:proofErr w:type="gramStart"/>
+      <w:r>
+        <w:t>=[</w:t>
+      </w:r>
+      <w:proofErr w:type="gramEnd"/>
       <w:r>
         <w:t>]</w:t>
       </w:r>
@@ -1613,7 +1713,15 @@
         </w:numPr>
       </w:pPr>
       <w:r>
-        <w:t xml:space="preserve">Every month I will add the components of split of salary , </w:t>
+        <w:t xml:space="preserve">Every month I will add the components of split of </w:t>
+      </w:r>
+      <w:proofErr w:type="gramStart"/>
+      <w:r>
+        <w:t>salary ,</w:t>
+      </w:r>
+      <w:proofErr w:type="gramEnd"/>
+      <w:r>
+        <w:t xml:space="preserve"> </w:t>
       </w:r>
     </w:p>
     <w:p>
@@ -1984,7 +2092,15 @@
         <w:ind w:left="720"/>
       </w:pPr>
       <w:r>
-        <w:t>State should fetched as like employee module</w:t>
+        <w:t xml:space="preserve">State should </w:t>
+      </w:r>
+      <w:proofErr w:type="gramStart"/>
+      <w:r>
+        <w:t>fetched</w:t>
+      </w:r>
+      <w:proofErr w:type="gramEnd"/>
+      <w:r>
+        <w:t xml:space="preserve"> as like employee module</w:t>
       </w:r>
     </w:p>
     <w:p>
@@ -2002,7 +2118,15 @@
       </w:r>
       <w:proofErr w:type="spellEnd"/>
       <w:r>
-        <w:t xml:space="preserve"> selection based on , which state selected</w:t>
+        <w:t xml:space="preserve"> selection based </w:t>
+      </w:r>
+      <w:proofErr w:type="gramStart"/>
+      <w:r>
+        <w:t>on ,</w:t>
+      </w:r>
+      <w:proofErr w:type="gramEnd"/>
+      <w:r>
+        <w:t xml:space="preserve"> which state selected</w:t>
       </w:r>
     </w:p>
     <w:p>
@@ -2503,10 +2627,18 @@
         </w:rPr>
       </w:pPr>
       <w:r>
-        <w:t xml:space="preserve">initially quotation </w:t>
-      </w:r>
-      <w:r>
-        <w:t xml:space="preserve"> created and save as draft mode, </w:t>
+        <w:t xml:space="preserve">initially </w:t>
+      </w:r>
+      <w:proofErr w:type="gramStart"/>
+      <w:r>
+        <w:t xml:space="preserve">quotation </w:t>
+      </w:r>
+      <w:r>
+        <w:t xml:space="preserve"> created</w:t>
+      </w:r>
+      <w:proofErr w:type="gramEnd"/>
+      <w:r>
+        <w:t xml:space="preserve"> and save as draft mode, </w:t>
       </w:r>
     </w:p>
     <w:p>
@@ -2524,13 +2656,26 @@
         <w:t xml:space="preserve">quotation </w:t>
       </w:r>
       <w:r>
-        <w:t xml:space="preserve">saved in draft status, it should be listed in workflow approval </w:t>
-      </w:r>
+        <w:t xml:space="preserve">saved in draft </w:t>
+      </w:r>
+      <w:proofErr w:type="gramStart"/>
+      <w:r>
+        <w:t>status,</w:t>
+      </w:r>
+      <w:proofErr w:type="gramEnd"/>
+      <w:r>
+        <w:t xml:space="preserve"> it should be listed in workflow approval </w:t>
+      </w:r>
+      <w:proofErr w:type="gramStart"/>
       <w:r>
         <w:t xml:space="preserve">to </w:t>
       </w:r>
       <w:r>
-        <w:t xml:space="preserve"> admin </w:t>
+        <w:t xml:space="preserve"> admin</w:t>
+      </w:r>
+      <w:proofErr w:type="gramEnd"/>
+      <w:r>
+        <w:t xml:space="preserve"> </w:t>
       </w:r>
     </w:p>
     <w:p>
@@ -2553,11 +2698,24 @@
       <w:r>
         <w:t xml:space="preserve">to review </w:t>
       </w:r>
+      <w:proofErr w:type="gramStart"/>
       <w:r>
         <w:t xml:space="preserve">quotation </w:t>
       </w:r>
       <w:r>
-        <w:t>, it navigate to that particular quotation</w:t>
+        <w:t>,</w:t>
+      </w:r>
+      <w:proofErr w:type="gramEnd"/>
+      <w:r>
+        <w:t xml:space="preserve"> it </w:t>
+      </w:r>
+      <w:proofErr w:type="gramStart"/>
+      <w:r>
+        <w:t>navigate</w:t>
+      </w:r>
+      <w:proofErr w:type="gramEnd"/>
+      <w:r>
+        <w:t xml:space="preserve"> to that particular quotation</w:t>
       </w:r>
     </w:p>
     <w:p>
@@ -2601,13 +2759,21 @@
         </w:rPr>
       </w:pPr>
       <w:r>
-        <w:t xml:space="preserve">and status </w:t>
+        <w:t xml:space="preserve">and </w:t>
+      </w:r>
+      <w:proofErr w:type="gramStart"/>
+      <w:r>
+        <w:t xml:space="preserve">status </w:t>
       </w:r>
       <w:r>
         <w:t xml:space="preserve"> </w:t>
       </w:r>
       <w:r>
-        <w:t xml:space="preserve">to “Approved” then only </w:t>
+        <w:t>to</w:t>
+      </w:r>
+      <w:proofErr w:type="gramEnd"/>
+      <w:r>
+        <w:t xml:space="preserve"> “Approved” then only </w:t>
       </w:r>
       <w:r>
         <w:t>created quotation can submit to sent customer. And can downloaded in pdf format</w:t>
@@ -2637,8 +2803,16 @@
         <w:rPr>
           <w:lang w:val="en-US"/>
         </w:rPr>
-        <w:t>, version of the quotation should maintained</w:t>
-      </w:r>
+        <w:t xml:space="preserve">, version of the quotation should </w:t>
+      </w:r>
+      <w:proofErr w:type="gramStart"/>
+      <w:r>
+        <w:rPr>
+          <w:lang w:val="en-US"/>
+        </w:rPr>
+        <w:t>maintained</w:t>
+      </w:r>
+      <w:proofErr w:type="gramEnd"/>
     </w:p>
     <w:p>
       <w:pPr>
@@ -2705,13 +2879,27 @@
         <w:rPr>
           <w:lang w:val="en-US"/>
         </w:rPr>
-        <w:t>approved by customer</w:t>
-      </w:r>
-      <w:r>
-        <w:rPr>
-          <w:lang w:val="en-US"/>
-        </w:rPr>
-        <w:t xml:space="preserve"> , nee</w:t>
+        <w:t xml:space="preserve">approved by </w:t>
+      </w:r>
+      <w:proofErr w:type="gramStart"/>
+      <w:r>
+        <w:rPr>
+          <w:lang w:val="en-US"/>
+        </w:rPr>
+        <w:t>customer</w:t>
+      </w:r>
+      <w:r>
+        <w:rPr>
+          <w:lang w:val="en-US"/>
+        </w:rPr>
+        <w:t xml:space="preserve"> ,</w:t>
+      </w:r>
+      <w:proofErr w:type="gramEnd"/>
+      <w:r>
+        <w:rPr>
+          <w:lang w:val="en-US"/>
+        </w:rPr>
+        <w:t xml:space="preserve"> nee</w:t>
       </w:r>
       <w:r>
         <w:rPr>
@@ -2776,6 +2964,7 @@
         </w:rPr>
         <w:t xml:space="preserve">create </w:t>
       </w:r>
+      <w:proofErr w:type="gramStart"/>
       <w:r>
         <w:rPr>
           <w:lang w:val="en-US"/>
@@ -2798,7 +2987,14 @@
         <w:rPr>
           <w:lang w:val="en-US"/>
         </w:rPr>
-        <w:t>of m</w:t>
+        <w:t>of</w:t>
+      </w:r>
+      <w:proofErr w:type="gramEnd"/>
+      <w:r>
+        <w:rPr>
+          <w:lang w:val="en-US"/>
+        </w:rPr>
+        <w:t xml:space="preserve"> m</w:t>
       </w:r>
       <w:r>
         <w:rPr>
@@ -2819,13 +3015,27 @@
         <w:rPr>
           <w:lang w:val="en-US"/>
         </w:rPr>
-        <w:t xml:space="preserve">Material issued to against the work order </w:t>
-      </w:r>
-      <w:r>
-        <w:rPr>
-          <w:lang w:val="en-US"/>
-        </w:rPr>
-        <w:t>, which are fetched from quotation</w:t>
+        <w:t xml:space="preserve">Material issued to against the work </w:t>
+      </w:r>
+      <w:proofErr w:type="gramStart"/>
+      <w:r>
+        <w:rPr>
+          <w:lang w:val="en-US"/>
+        </w:rPr>
+        <w:t xml:space="preserve">order </w:t>
+      </w:r>
+      <w:r>
+        <w:rPr>
+          <w:lang w:val="en-US"/>
+        </w:rPr>
+        <w:t>,</w:t>
+      </w:r>
+      <w:proofErr w:type="gramEnd"/>
+      <w:r>
+        <w:rPr>
+          <w:lang w:val="en-US"/>
+        </w:rPr>
+        <w:t xml:space="preserve"> which are fetched from quotation</w:t>
       </w:r>
       <w:r>
         <w:rPr>
@@ -2953,7 +3163,21 @@
         <w:rPr>
           <w:lang w:val="en-US"/>
         </w:rPr>
-        <w:t xml:space="preserve">adding work order item, is it required to adding two place in work items and material issue tracking, </w:t>
+        <w:t xml:space="preserve">adding work order item, is it required to adding two </w:t>
+      </w:r>
+      <w:proofErr w:type="gramStart"/>
+      <w:r>
+        <w:rPr>
+          <w:lang w:val="en-US"/>
+        </w:rPr>
+        <w:t>place</w:t>
+      </w:r>
+      <w:proofErr w:type="gramEnd"/>
+      <w:r>
+        <w:rPr>
+          <w:lang w:val="en-US"/>
+        </w:rPr>
+        <w:t xml:space="preserve"> in work items and material issue tracking, </w:t>
       </w:r>
       <w:proofErr w:type="spellStart"/>
       <w:r>
@@ -3226,11 +3450,19 @@
           <w:lang w:val="en-US"/>
         </w:rPr>
       </w:pPr>
-      <w:r>
-        <w:rPr>
-          <w:lang w:val="en-US"/>
-        </w:rPr>
-        <w:t>So if your quotation only contains physical products, it can feel duplicated because the same product appears in both. But they answer different questions:</w:t>
+      <w:proofErr w:type="gramStart"/>
+      <w:r>
+        <w:rPr>
+          <w:lang w:val="en-US"/>
+        </w:rPr>
+        <w:t>So</w:t>
+      </w:r>
+      <w:proofErr w:type="gramEnd"/>
+      <w:r>
+        <w:rPr>
+          <w:lang w:val="en-US"/>
+        </w:rPr>
+        <w:t xml:space="preserve"> if your quotation only contains physical products, it can feel duplicated because the same product appears in both. But they answer different questions:</w:t>
       </w:r>
     </w:p>
     <w:p>
@@ -3562,7 +3794,21 @@
         <w:rPr>
           <w:lang w:val="en-US"/>
         </w:rPr>
-        <w:t>because stock should be maintain while enter purchase items and material issue debit from stock and add the product return the material in material return modules</w:t>
+        <w:t xml:space="preserve">because stock should be </w:t>
+      </w:r>
+      <w:proofErr w:type="gramStart"/>
+      <w:r>
+        <w:rPr>
+          <w:lang w:val="en-US"/>
+        </w:rPr>
+        <w:t>maintain</w:t>
+      </w:r>
+      <w:proofErr w:type="gramEnd"/>
+      <w:r>
+        <w:rPr>
+          <w:lang w:val="en-US"/>
+        </w:rPr>
+        <w:t xml:space="preserve"> while enter purchase items and material issue debit from stock and add the product return the material in material return modules</w:t>
       </w:r>
     </w:p>
     <w:p>
@@ -3582,6 +3828,12 @@
           <w:lang w:val="en-US"/>
         </w:rPr>
       </w:pPr>
+      <w:r>
+        <w:rPr>
+          <w:lang w:val="en-US"/>
+        </w:rPr>
+        <w:t>Yes, that is my recommendation.</w:t>
+      </w:r>
     </w:p>
     <w:p>
       <w:pPr>
@@ -3591,6 +3843,2557 @@
           <w:lang w:val="en-US"/>
         </w:rPr>
       </w:pPr>
+      <w:r>
+        <w:rPr>
+          <w:lang w:val="en-US"/>
+        </w:rPr>
+        <w:t xml:space="preserve">Add these as products, but treat them as </w:t>
+      </w:r>
+      <w:r>
+        <w:rPr>
+          <w:b/>
+          <w:bCs/>
+          <w:lang w:val="en-US"/>
+        </w:rPr>
+        <w:t>service/labor products</w:t>
+      </w:r>
+      <w:r>
+        <w:rPr>
+          <w:lang w:val="en-US"/>
+        </w:rPr>
+        <w:t>, not stock materials:</w:t>
+      </w:r>
+    </w:p>
+    <w:p>
+      <w:pPr>
+        <w:pStyle w:val="NoSpacing"/>
+        <w:numPr>
+          <w:ilvl w:val="0"/>
+          <w:numId w:val="17"/>
+        </w:numPr>
+        <w:rPr>
+          <w:lang w:val="en-US"/>
+        </w:rPr>
+      </w:pPr>
+      <w:r>
+        <w:rPr>
+          <w:lang w:val="en-US"/>
+        </w:rPr>
+        <w:t>Installation Charge</w:t>
+      </w:r>
+    </w:p>
+    <w:p>
+      <w:pPr>
+        <w:pStyle w:val="NoSpacing"/>
+        <w:numPr>
+          <w:ilvl w:val="0"/>
+          <w:numId w:val="17"/>
+        </w:numPr>
+        <w:rPr>
+          <w:lang w:val="en-US"/>
+        </w:rPr>
+      </w:pPr>
+      <w:r>
+        <w:rPr>
+          <w:lang w:val="en-US"/>
+        </w:rPr>
+        <w:t>Service Charge</w:t>
+      </w:r>
+    </w:p>
+    <w:p>
+      <w:pPr>
+        <w:pStyle w:val="NoSpacing"/>
+        <w:numPr>
+          <w:ilvl w:val="0"/>
+          <w:numId w:val="17"/>
+        </w:numPr>
+        <w:rPr>
+          <w:lang w:val="en-US"/>
+        </w:rPr>
+      </w:pPr>
+      <w:r>
+        <w:rPr>
+          <w:lang w:val="en-US"/>
+        </w:rPr>
+        <w:t>Cable Laying Labor</w:t>
+      </w:r>
+    </w:p>
+    <w:p>
+      <w:pPr>
+        <w:pStyle w:val="NoSpacing"/>
+        <w:numPr>
+          <w:ilvl w:val="0"/>
+          <w:numId w:val="17"/>
+        </w:numPr>
+        <w:rPr>
+          <w:lang w:val="en-US"/>
+        </w:rPr>
+      </w:pPr>
+      <w:r>
+        <w:rPr>
+          <w:lang w:val="en-US"/>
+        </w:rPr>
+        <w:t>Camera Configuration</w:t>
+      </w:r>
+    </w:p>
+    <w:p>
+      <w:pPr>
+        <w:pStyle w:val="NoSpacing"/>
+        <w:numPr>
+          <w:ilvl w:val="0"/>
+          <w:numId w:val="17"/>
+        </w:numPr>
+        <w:rPr>
+          <w:lang w:val="en-US"/>
+        </w:rPr>
+      </w:pPr>
+      <w:r>
+        <w:rPr>
+          <w:lang w:val="en-US"/>
+        </w:rPr>
+        <w:t>Site Visit Charge</w:t>
+      </w:r>
+    </w:p>
+    <w:p>
+      <w:pPr>
+        <w:pStyle w:val="NoSpacing"/>
+        <w:numPr>
+          <w:ilvl w:val="0"/>
+          <w:numId w:val="17"/>
+        </w:numPr>
+        <w:rPr>
+          <w:lang w:val="en-US"/>
+        </w:rPr>
+      </w:pPr>
+      <w:r>
+        <w:rPr>
+          <w:lang w:val="en-US"/>
+        </w:rPr>
+        <w:t>Maintenance Charge</w:t>
+      </w:r>
+    </w:p>
+    <w:p>
+      <w:pPr>
+        <w:pStyle w:val="NoSpacing"/>
+        <w:ind w:left="1080"/>
+        <w:rPr>
+          <w:lang w:val="en-US"/>
+        </w:rPr>
+      </w:pPr>
+      <w:r>
+        <w:rPr>
+          <w:lang w:val="en-US"/>
+        </w:rPr>
+        <w:t>Use them in Work Items so they can flow into invoice items. They should not be used in Material Issue.</w:t>
+      </w:r>
+    </w:p>
+    <w:p>
+      <w:pPr>
+        <w:pStyle w:val="NoSpacing"/>
+        <w:ind w:left="1080"/>
+        <w:rPr>
+          <w:lang w:val="en-US"/>
+        </w:rPr>
+      </w:pPr>
+      <w:r>
+        <w:rPr>
+          <w:lang w:val="en-US"/>
+        </w:rPr>
+        <w:t>Suggested setup in Product Master:</w:t>
+      </w:r>
+    </w:p>
+    <w:p>
+      <w:pPr>
+        <w:pStyle w:val="NoSpacing"/>
+        <w:numPr>
+          <w:ilvl w:val="0"/>
+          <w:numId w:val="18"/>
+        </w:numPr>
+        <w:rPr>
+          <w:lang w:val="en-US"/>
+        </w:rPr>
+      </w:pPr>
+      <w:proofErr w:type="spellStart"/>
+      <w:r>
+        <w:rPr>
+          <w:lang w:val="en-US"/>
+        </w:rPr>
+        <w:t>product_type</w:t>
+      </w:r>
+      <w:proofErr w:type="spellEnd"/>
+      <w:r>
+        <w:rPr>
+          <w:lang w:val="en-US"/>
+        </w:rPr>
+        <w:t>: ideally add this field later with values like MATERIAL, SERVICE, LABOR</w:t>
+      </w:r>
+    </w:p>
+    <w:p>
+      <w:pPr>
+        <w:pStyle w:val="NoSpacing"/>
+        <w:numPr>
+          <w:ilvl w:val="0"/>
+          <w:numId w:val="18"/>
+        </w:numPr>
+        <w:rPr>
+          <w:lang w:val="en-US"/>
+        </w:rPr>
+      </w:pPr>
+      <w:r>
+        <w:rPr>
+          <w:lang w:val="en-US"/>
+        </w:rPr>
+        <w:t>For now, use category like Service or Labor</w:t>
+      </w:r>
+    </w:p>
+    <w:p>
+      <w:pPr>
+        <w:pStyle w:val="NoSpacing"/>
+        <w:numPr>
+          <w:ilvl w:val="0"/>
+          <w:numId w:val="18"/>
+        </w:numPr>
+        <w:rPr>
+          <w:lang w:val="en-US"/>
+        </w:rPr>
+      </w:pPr>
+      <w:proofErr w:type="spellStart"/>
+      <w:r>
+        <w:rPr>
+          <w:lang w:val="en-US"/>
+        </w:rPr>
+        <w:t>purchase_price</w:t>
+      </w:r>
+      <w:proofErr w:type="spellEnd"/>
+      <w:r>
+        <w:rPr>
+          <w:lang w:val="en-US"/>
+        </w:rPr>
+        <w:t>: 0</w:t>
+      </w:r>
+    </w:p>
+    <w:p>
+      <w:pPr>
+        <w:pStyle w:val="NoSpacing"/>
+        <w:numPr>
+          <w:ilvl w:val="0"/>
+          <w:numId w:val="18"/>
+        </w:numPr>
+        <w:rPr>
+          <w:lang w:val="en-US"/>
+        </w:rPr>
+      </w:pPr>
+      <w:proofErr w:type="spellStart"/>
+      <w:r>
+        <w:rPr>
+          <w:lang w:val="en-US"/>
+        </w:rPr>
+        <w:t>selling_price</w:t>
+      </w:r>
+      <w:proofErr w:type="spellEnd"/>
+      <w:r>
+        <w:rPr>
+          <w:lang w:val="en-US"/>
+        </w:rPr>
+        <w:t>: your standard charge</w:t>
+      </w:r>
+    </w:p>
+    <w:p>
+      <w:pPr>
+        <w:pStyle w:val="NoSpacing"/>
+        <w:numPr>
+          <w:ilvl w:val="0"/>
+          <w:numId w:val="18"/>
+        </w:numPr>
+        <w:rPr>
+          <w:lang w:val="en-US"/>
+        </w:rPr>
+      </w:pPr>
+      <w:r>
+        <w:rPr>
+          <w:lang w:val="en-US"/>
+        </w:rPr>
+        <w:t>unit: JOB, HOUR, MTR, or NOS</w:t>
+      </w:r>
+    </w:p>
+    <w:p>
+      <w:pPr>
+        <w:pStyle w:val="NoSpacing"/>
+        <w:numPr>
+          <w:ilvl w:val="0"/>
+          <w:numId w:val="18"/>
+        </w:numPr>
+        <w:rPr>
+          <w:lang w:val="en-US"/>
+        </w:rPr>
+      </w:pPr>
+      <w:proofErr w:type="spellStart"/>
+      <w:r>
+        <w:rPr>
+          <w:lang w:val="en-US"/>
+        </w:rPr>
+        <w:t>gst_percent</w:t>
+      </w:r>
+      <w:proofErr w:type="spellEnd"/>
+      <w:r>
+        <w:rPr>
+          <w:lang w:val="en-US"/>
+        </w:rPr>
+        <w:t>: applicable GST</w:t>
+      </w:r>
+    </w:p>
+    <w:p>
+      <w:pPr>
+        <w:pStyle w:val="NoSpacing"/>
+        <w:numPr>
+          <w:ilvl w:val="0"/>
+          <w:numId w:val="18"/>
+        </w:numPr>
+        <w:rPr>
+          <w:lang w:val="en-US"/>
+        </w:rPr>
+      </w:pPr>
+      <w:proofErr w:type="spellStart"/>
+      <w:r>
+        <w:rPr>
+          <w:lang w:val="en-US"/>
+        </w:rPr>
+        <w:t>reorder_level</w:t>
+      </w:r>
+      <w:proofErr w:type="spellEnd"/>
+      <w:r>
+        <w:rPr>
+          <w:lang w:val="en-US"/>
+        </w:rPr>
+        <w:t>: 0</w:t>
+      </w:r>
+    </w:p>
+    <w:p>
+      <w:pPr>
+        <w:pStyle w:val="NoSpacing"/>
+        <w:numPr>
+          <w:ilvl w:val="0"/>
+          <w:numId w:val="18"/>
+        </w:numPr>
+        <w:rPr>
+          <w:lang w:val="en-US"/>
+        </w:rPr>
+      </w:pPr>
+      <w:r>
+        <w:rPr>
+          <w:lang w:val="en-US"/>
+        </w:rPr>
+        <w:t>status: ACTIVE</w:t>
+      </w:r>
+    </w:p>
+    <w:p>
+      <w:pPr>
+        <w:pStyle w:val="NoSpacing"/>
+        <w:ind w:left="1080"/>
+        <w:rPr>
+          <w:lang w:val="en-US"/>
+        </w:rPr>
+      </w:pPr>
+      <w:r>
+        <w:rPr>
+          <w:lang w:val="en-US"/>
+        </w:rPr>
+        <w:t>Important rule:</w:t>
+      </w:r>
+    </w:p>
+    <w:p>
+      <w:pPr>
+        <w:pStyle w:val="NoSpacing"/>
+        <w:numPr>
+          <w:ilvl w:val="0"/>
+          <w:numId w:val="19"/>
+        </w:numPr>
+        <w:rPr>
+          <w:lang w:val="en-US"/>
+        </w:rPr>
+      </w:pPr>
+      <w:r>
+        <w:rPr>
+          <w:lang w:val="en-US"/>
+        </w:rPr>
+        <w:t>Physical items like Camera, Cable, Connector: use in Material Issue</w:t>
+      </w:r>
+    </w:p>
+    <w:p>
+      <w:pPr>
+        <w:pStyle w:val="NoSpacing"/>
+        <w:numPr>
+          <w:ilvl w:val="0"/>
+          <w:numId w:val="19"/>
+        </w:numPr>
+        <w:rPr>
+          <w:lang w:val="en-US"/>
+        </w:rPr>
+      </w:pPr>
+      <w:r>
+        <w:rPr>
+          <w:lang w:val="en-US"/>
+        </w:rPr>
+        <w:t>Labor/service items like Installation Charge: use in Work Items</w:t>
+      </w:r>
+    </w:p>
+    <w:p>
+      <w:pPr>
+        <w:pStyle w:val="NoSpacing"/>
+        <w:ind w:left="1080"/>
+        <w:rPr>
+          <w:lang w:val="en-US"/>
+        </w:rPr>
+      </w:pPr>
+      <w:r>
+        <w:rPr>
+          <w:lang w:val="en-US"/>
+        </w:rPr>
+        <w:t xml:space="preserve">If we add </w:t>
+      </w:r>
+      <w:proofErr w:type="spellStart"/>
+      <w:r>
+        <w:rPr>
+          <w:lang w:val="en-US"/>
+        </w:rPr>
+        <w:t>product_type</w:t>
+      </w:r>
+      <w:proofErr w:type="spellEnd"/>
+      <w:r>
+        <w:rPr>
+          <w:lang w:val="en-US"/>
+        </w:rPr>
+        <w:t>, the UI can filter:</w:t>
+      </w:r>
+    </w:p>
+    <w:p>
+      <w:pPr>
+        <w:pStyle w:val="NoSpacing"/>
+        <w:numPr>
+          <w:ilvl w:val="0"/>
+          <w:numId w:val="20"/>
+        </w:numPr>
+        <w:rPr>
+          <w:lang w:val="en-US"/>
+        </w:rPr>
+      </w:pPr>
+      <w:r>
+        <w:rPr>
+          <w:lang w:val="en-US"/>
+        </w:rPr>
+        <w:t>Work Items dropdown: show all products, or preferably SERVICE, LABOR, and billable MATERIAL</w:t>
+      </w:r>
+    </w:p>
+    <w:p>
+      <w:pPr>
+        <w:pStyle w:val="NoSpacing"/>
+        <w:numPr>
+          <w:ilvl w:val="0"/>
+          <w:numId w:val="20"/>
+        </w:numPr>
+        <w:rPr>
+          <w:lang w:val="en-US"/>
+        </w:rPr>
+      </w:pPr>
+      <w:r>
+        <w:rPr>
+          <w:lang w:val="en-US"/>
+        </w:rPr>
+        <w:t>Material Issue dropdown: show only MATERIAL products</w:t>
+      </w:r>
+    </w:p>
+    <w:p>
+      <w:pPr>
+        <w:pStyle w:val="NoSpacing"/>
+        <w:ind w:left="1080"/>
+        <w:rPr>
+          <w:lang w:val="en-US"/>
+        </w:rPr>
+      </w:pPr>
+      <w:r>
+        <w:rPr>
+          <w:lang w:val="en-US"/>
+        </w:rPr>
+        <w:t>That would make the flow much cleaner.</w:t>
+      </w:r>
+    </w:p>
+    <w:p>
+      <w:pPr>
+        <w:pStyle w:val="NoSpacing"/>
+        <w:ind w:left="1080"/>
+        <w:rPr>
+          <w:lang w:val="en-US"/>
+        </w:rPr>
+      </w:pPr>
+    </w:p>
+    <w:p>
+      <w:pPr>
+        <w:pStyle w:val="NoSpacing"/>
+        <w:ind w:left="1080"/>
+        <w:rPr>
+          <w:lang w:val="en-US"/>
+        </w:rPr>
+      </w:pPr>
+    </w:p>
+    <w:p>
+      <w:pPr>
+        <w:pStyle w:val="NoSpacing"/>
+        <w:ind w:left="1080"/>
+        <w:rPr>
+          <w:lang w:val="en-US"/>
+        </w:rPr>
+      </w:pPr>
+      <w:r>
+        <w:rPr>
+          <w:lang w:val="en-US"/>
+        </w:rPr>
+        <w:t xml:space="preserve">Add product details first in </w:t>
+      </w:r>
+      <w:r>
+        <w:rPr>
+          <w:b/>
+          <w:bCs/>
+          <w:lang w:val="en-US"/>
+        </w:rPr>
+        <w:t>Product Master</w:t>
+      </w:r>
+      <w:r>
+        <w:rPr>
+          <w:lang w:val="en-US"/>
+        </w:rPr>
+        <w:t>, not directly in Work Items or Material Issue.</w:t>
+      </w:r>
+    </w:p>
+    <w:p>
+      <w:pPr>
+        <w:pStyle w:val="NoSpacing"/>
+        <w:ind w:left="1080"/>
+        <w:rPr>
+          <w:lang w:val="en-US"/>
+        </w:rPr>
+      </w:pPr>
+      <w:r>
+        <w:rPr>
+          <w:lang w:val="en-US"/>
+        </w:rPr>
+        <w:t>Then use them like this:</w:t>
+      </w:r>
+    </w:p>
+    <w:p>
+      <w:pPr>
+        <w:pStyle w:val="NoSpacing"/>
+        <w:numPr>
+          <w:ilvl w:val="0"/>
+          <w:numId w:val="21"/>
+        </w:numPr>
+        <w:rPr>
+          <w:lang w:val="en-US"/>
+        </w:rPr>
+      </w:pPr>
+      <w:r>
+        <w:rPr>
+          <w:b/>
+          <w:bCs/>
+          <w:lang w:val="en-US"/>
+        </w:rPr>
+        <w:t>Work Items</w:t>
+      </w:r>
+      <w:r>
+        <w:rPr>
+          <w:lang w:val="en-US"/>
+        </w:rPr>
+        <w:br/>
+        <w:t>Add billable/customer-facing items here.</w:t>
+      </w:r>
+      <w:r>
+        <w:rPr>
+          <w:lang w:val="en-US"/>
+        </w:rPr>
+        <w:br/>
+        <w:t>Example:</w:t>
+      </w:r>
+    </w:p>
+    <w:p>
+      <w:pPr>
+        <w:pStyle w:val="NoSpacing"/>
+        <w:numPr>
+          <w:ilvl w:val="1"/>
+          <w:numId w:val="21"/>
+        </w:numPr>
+        <w:rPr>
+          <w:lang w:val="en-US"/>
+        </w:rPr>
+      </w:pPr>
+      <w:r>
+        <w:rPr>
+          <w:lang w:val="en-US"/>
+        </w:rPr>
+        <w:t>Installation Charge</w:t>
+      </w:r>
+    </w:p>
+    <w:p>
+      <w:pPr>
+        <w:pStyle w:val="NoSpacing"/>
+        <w:numPr>
+          <w:ilvl w:val="1"/>
+          <w:numId w:val="21"/>
+        </w:numPr>
+        <w:rPr>
+          <w:lang w:val="en-US"/>
+        </w:rPr>
+      </w:pPr>
+      <w:r>
+        <w:rPr>
+          <w:lang w:val="en-US"/>
+        </w:rPr>
+        <w:t>Cable Laying Labor</w:t>
+      </w:r>
+    </w:p>
+    <w:p>
+      <w:pPr>
+        <w:pStyle w:val="NoSpacing"/>
+        <w:numPr>
+          <w:ilvl w:val="1"/>
+          <w:numId w:val="21"/>
+        </w:numPr>
+        <w:rPr>
+          <w:lang w:val="en-US"/>
+        </w:rPr>
+      </w:pPr>
+      <w:r>
+        <w:rPr>
+          <w:lang w:val="en-US"/>
+        </w:rPr>
+        <w:t>Camera Configuration</w:t>
+      </w:r>
+    </w:p>
+    <w:p>
+      <w:pPr>
+        <w:pStyle w:val="NoSpacing"/>
+        <w:numPr>
+          <w:ilvl w:val="1"/>
+          <w:numId w:val="21"/>
+        </w:numPr>
+        <w:rPr>
+          <w:lang w:val="en-US"/>
+        </w:rPr>
+      </w:pPr>
+      <w:r>
+        <w:rPr>
+          <w:lang w:val="en-US"/>
+        </w:rPr>
+        <w:t>Service Charge</w:t>
+      </w:r>
+    </w:p>
+    <w:p>
+      <w:pPr>
+        <w:pStyle w:val="NoSpacing"/>
+        <w:ind w:left="1080"/>
+        <w:rPr>
+          <w:lang w:val="en-US"/>
+        </w:rPr>
+      </w:pPr>
+      <w:r>
+        <w:rPr>
+          <w:lang w:val="en-US"/>
+        </w:rPr>
+        <w:t>These go to invoice.</w:t>
+      </w:r>
+    </w:p>
+    <w:p>
+      <w:pPr>
+        <w:pStyle w:val="NoSpacing"/>
+        <w:numPr>
+          <w:ilvl w:val="0"/>
+          <w:numId w:val="21"/>
+        </w:numPr>
+        <w:rPr>
+          <w:lang w:val="en-US"/>
+        </w:rPr>
+      </w:pPr>
+      <w:r>
+        <w:rPr>
+          <w:b/>
+          <w:bCs/>
+          <w:lang w:val="en-US"/>
+        </w:rPr>
+        <w:t>Material Issue</w:t>
+      </w:r>
+      <w:r>
+        <w:rPr>
+          <w:lang w:val="en-US"/>
+        </w:rPr>
+        <w:br/>
+        <w:t>Add physical stock/material items here.</w:t>
+      </w:r>
+      <w:r>
+        <w:rPr>
+          <w:lang w:val="en-US"/>
+        </w:rPr>
+        <w:br/>
+        <w:t>Example:</w:t>
+      </w:r>
+    </w:p>
+    <w:p>
+      <w:pPr>
+        <w:pStyle w:val="NoSpacing"/>
+        <w:numPr>
+          <w:ilvl w:val="1"/>
+          <w:numId w:val="21"/>
+        </w:numPr>
+        <w:rPr>
+          <w:lang w:val="en-US"/>
+        </w:rPr>
+      </w:pPr>
+      <w:r>
+        <w:rPr>
+          <w:lang w:val="en-US"/>
+        </w:rPr>
+        <w:t>CCTV Camera</w:t>
+      </w:r>
+    </w:p>
+    <w:p>
+      <w:pPr>
+        <w:pStyle w:val="NoSpacing"/>
+        <w:numPr>
+          <w:ilvl w:val="1"/>
+          <w:numId w:val="21"/>
+        </w:numPr>
+        <w:rPr>
+          <w:lang w:val="en-US"/>
+        </w:rPr>
+      </w:pPr>
+      <w:r>
+        <w:rPr>
+          <w:lang w:val="en-US"/>
+        </w:rPr>
+        <w:t>Cable</w:t>
+      </w:r>
+    </w:p>
+    <w:p>
+      <w:pPr>
+        <w:pStyle w:val="NoSpacing"/>
+        <w:numPr>
+          <w:ilvl w:val="1"/>
+          <w:numId w:val="21"/>
+        </w:numPr>
+        <w:rPr>
+          <w:lang w:val="en-US"/>
+        </w:rPr>
+      </w:pPr>
+      <w:r>
+        <w:rPr>
+          <w:lang w:val="en-US"/>
+        </w:rPr>
+        <w:t>Connector</w:t>
+      </w:r>
+    </w:p>
+    <w:p>
+      <w:pPr>
+        <w:pStyle w:val="NoSpacing"/>
+        <w:numPr>
+          <w:ilvl w:val="1"/>
+          <w:numId w:val="21"/>
+        </w:numPr>
+        <w:rPr>
+          <w:lang w:val="en-US"/>
+        </w:rPr>
+      </w:pPr>
+      <w:r>
+        <w:rPr>
+          <w:lang w:val="en-US"/>
+        </w:rPr>
+        <w:t>Router</w:t>
+      </w:r>
+    </w:p>
+    <w:p>
+      <w:pPr>
+        <w:pStyle w:val="NoSpacing"/>
+        <w:numPr>
+          <w:ilvl w:val="1"/>
+          <w:numId w:val="21"/>
+        </w:numPr>
+        <w:rPr>
+          <w:lang w:val="en-US"/>
+        </w:rPr>
+      </w:pPr>
+      <w:r>
+        <w:rPr>
+          <w:lang w:val="en-US"/>
+        </w:rPr>
+        <w:t>ONU</w:t>
+      </w:r>
+    </w:p>
+    <w:p>
+      <w:pPr>
+        <w:pStyle w:val="NoSpacing"/>
+        <w:ind w:left="1080"/>
+        <w:rPr>
+          <w:lang w:val="en-US"/>
+        </w:rPr>
+      </w:pPr>
+      <w:r>
+        <w:rPr>
+          <w:lang w:val="en-US"/>
+        </w:rPr>
+        <w:t>These debit stock and can be returned later.</w:t>
+      </w:r>
+    </w:p>
+    <w:p>
+      <w:pPr>
+        <w:pStyle w:val="NoSpacing"/>
+        <w:ind w:left="1080"/>
+        <w:rPr>
+          <w:lang w:val="en-US"/>
+        </w:rPr>
+      </w:pPr>
+      <w:r>
+        <w:rPr>
+          <w:lang w:val="en-US"/>
+        </w:rPr>
+        <w:t>About your second question: yes, technically after adding Work Items, we can fetch/copy selected physical products into Material Issue. But I recommend this rule:</w:t>
+      </w:r>
+    </w:p>
+    <w:p>
+      <w:pPr>
+        <w:pStyle w:val="NoSpacing"/>
+        <w:numPr>
+          <w:ilvl w:val="0"/>
+          <w:numId w:val="22"/>
+        </w:numPr>
+        <w:rPr>
+          <w:lang w:val="en-US"/>
+        </w:rPr>
+      </w:pPr>
+      <w:r>
+        <w:rPr>
+          <w:lang w:val="en-US"/>
+        </w:rPr>
+        <w:t>If Work Item product is a physical material, copy it to Material Issue.</w:t>
+      </w:r>
+    </w:p>
+    <w:p>
+      <w:pPr>
+        <w:pStyle w:val="NoSpacing"/>
+        <w:numPr>
+          <w:ilvl w:val="0"/>
+          <w:numId w:val="22"/>
+        </w:numPr>
+        <w:rPr>
+          <w:lang w:val="en-US"/>
+        </w:rPr>
+      </w:pPr>
+      <w:r>
+        <w:rPr>
+          <w:lang w:val="en-US"/>
+        </w:rPr>
+        <w:t>If Work Item product is service/labor, do not copy it.</w:t>
+      </w:r>
+    </w:p>
+    <w:p>
+      <w:pPr>
+        <w:pStyle w:val="NoSpacing"/>
+        <w:ind w:left="1080"/>
+        <w:rPr>
+          <w:lang w:val="en-US"/>
+        </w:rPr>
+      </w:pPr>
+      <w:r>
+        <w:rPr>
+          <w:lang w:val="en-US"/>
+        </w:rPr>
+        <w:t xml:space="preserve">For that, we should add a </w:t>
+      </w:r>
+      <w:proofErr w:type="spellStart"/>
+      <w:r>
+        <w:rPr>
+          <w:lang w:val="en-US"/>
+        </w:rPr>
+        <w:t>product_type</w:t>
+      </w:r>
+      <w:proofErr w:type="spellEnd"/>
+      <w:r>
+        <w:rPr>
+          <w:lang w:val="en-US"/>
+        </w:rPr>
+        <w:t xml:space="preserve"> field:</w:t>
+      </w:r>
+    </w:p>
+    <w:p>
+      <w:pPr>
+        <w:pStyle w:val="NoSpacing"/>
+        <w:ind w:left="1080"/>
+        <w:rPr>
+          <w:lang w:val="en-US"/>
+        </w:rPr>
+      </w:pPr>
+      <w:proofErr w:type="spellStart"/>
+      <w:r>
+        <w:rPr>
+          <w:lang w:val="en-US"/>
+        </w:rPr>
+        <w:t>product_type</w:t>
+      </w:r>
+      <w:proofErr w:type="spellEnd"/>
+      <w:r>
+        <w:rPr>
+          <w:lang w:val="en-US"/>
+        </w:rPr>
+        <w:t xml:space="preserve"> ENUM('MATERIAL','SERVICE','LABOR') DEFAULT 'MATERIAL'</w:t>
+      </w:r>
+    </w:p>
+    <w:p>
+      <w:pPr>
+        <w:pStyle w:val="NoSpacing"/>
+        <w:ind w:left="1080"/>
+        <w:rPr>
+          <w:lang w:val="en-US"/>
+        </w:rPr>
+      </w:pPr>
+      <w:r>
+        <w:rPr>
+          <w:lang w:val="en-US"/>
+        </w:rPr>
+        <w:t>Then the system can automatically:</w:t>
+      </w:r>
+    </w:p>
+    <w:p>
+      <w:pPr>
+        <w:pStyle w:val="NoSpacing"/>
+        <w:numPr>
+          <w:ilvl w:val="0"/>
+          <w:numId w:val="23"/>
+        </w:numPr>
+        <w:rPr>
+          <w:lang w:val="en-US"/>
+        </w:rPr>
+      </w:pPr>
+      <w:r>
+        <w:rPr>
+          <w:lang w:val="en-US"/>
+        </w:rPr>
+        <w:t>Show SERVICE and LABOR in Work Items</w:t>
+      </w:r>
+    </w:p>
+    <w:p>
+      <w:pPr>
+        <w:pStyle w:val="NoSpacing"/>
+        <w:numPr>
+          <w:ilvl w:val="0"/>
+          <w:numId w:val="23"/>
+        </w:numPr>
+        <w:rPr>
+          <w:lang w:val="en-US"/>
+        </w:rPr>
+      </w:pPr>
+      <w:r>
+        <w:rPr>
+          <w:lang w:val="en-US"/>
+        </w:rPr>
+        <w:t>Show only MATERIAL in Material Issue</w:t>
+      </w:r>
+    </w:p>
+    <w:p>
+      <w:pPr>
+        <w:pStyle w:val="NoSpacing"/>
+        <w:numPr>
+          <w:ilvl w:val="0"/>
+          <w:numId w:val="23"/>
+        </w:numPr>
+        <w:rPr>
+          <w:lang w:val="en-US"/>
+        </w:rPr>
+      </w:pPr>
+      <w:r>
+        <w:rPr>
+          <w:lang w:val="en-US"/>
+        </w:rPr>
+        <w:t>Copy only MATERIAL work items into Material Issue</w:t>
+      </w:r>
+    </w:p>
+    <w:p>
+      <w:pPr>
+        <w:pStyle w:val="NoSpacing"/>
+        <w:ind w:left="1080"/>
+        <w:rPr>
+          <w:lang w:val="en-US"/>
+        </w:rPr>
+      </w:pPr>
+      <w:r>
+        <w:rPr>
+          <w:lang w:val="en-US"/>
+        </w:rPr>
+        <w:t xml:space="preserve">Without </w:t>
+      </w:r>
+      <w:proofErr w:type="spellStart"/>
+      <w:r>
+        <w:rPr>
+          <w:lang w:val="en-US"/>
+        </w:rPr>
+        <w:t>product_type</w:t>
+      </w:r>
+      <w:proofErr w:type="spellEnd"/>
+      <w:r>
+        <w:rPr>
+          <w:lang w:val="en-US"/>
+        </w:rPr>
+        <w:t>, the app cannot reliably know whether “Installation Charge” is stock or service.</w:t>
+      </w:r>
+    </w:p>
+    <w:p>
+      <w:pPr>
+        <w:pStyle w:val="NoSpacing"/>
+        <w:ind w:left="1080"/>
+        <w:rPr>
+          <w:lang w:val="en-US"/>
+        </w:rPr>
+      </w:pPr>
+    </w:p>
+    <w:p>
+      <w:pPr>
+        <w:pStyle w:val="NoSpacing"/>
+        <w:ind w:left="1080"/>
+        <w:rPr>
+          <w:lang w:val="en-US"/>
+        </w:rPr>
+      </w:pPr>
+    </w:p>
+    <w:p>
+      <w:pPr>
+        <w:pStyle w:val="NoSpacing"/>
+        <w:ind w:left="1080"/>
+        <w:rPr>
+          <w:lang w:val="en-US"/>
+        </w:rPr>
+      </w:pPr>
+    </w:p>
+    <w:p>
+      <w:pPr>
+        <w:pStyle w:val="NoSpacing"/>
+        <w:ind w:left="1080"/>
+        <w:rPr>
+          <w:lang w:val="en-US"/>
+        </w:rPr>
+      </w:pPr>
+      <w:r>
+        <w:rPr>
+          <w:lang w:val="en-US"/>
+        </w:rPr>
+        <w:t>Work order changes</w:t>
+      </w:r>
+    </w:p>
+    <w:p>
+      <w:pPr>
+        <w:pStyle w:val="NoSpacing"/>
+        <w:ind w:left="1080"/>
+        <w:rPr>
+          <w:lang w:val="en-US"/>
+        </w:rPr>
+      </w:pPr>
+    </w:p>
+    <w:p>
+      <w:pPr>
+        <w:pStyle w:val="NoSpacing"/>
+        <w:ind w:left="1080"/>
+        <w:rPr>
+          <w:lang w:val="en-US"/>
+        </w:rPr>
+      </w:pPr>
+      <w:r>
+        <w:rPr>
+          <w:lang w:val="en-US"/>
+        </w:rPr>
+        <w:t>1.</w:t>
+      </w:r>
+      <w:r>
+        <w:rPr>
+          <w:lang w:val="en-US"/>
+        </w:rPr>
+        <w:t xml:space="preserve">While create the new work order, in that screen </w:t>
+      </w:r>
+      <w:r>
+        <w:rPr>
+          <w:lang w:val="en-US"/>
+        </w:rPr>
+        <w:t>Work Items</w:t>
+      </w:r>
+      <w:r>
+        <w:rPr>
+          <w:lang w:val="en-US"/>
+        </w:rPr>
+        <w:t xml:space="preserve"> section we can </w:t>
+      </w:r>
+      <w:r>
+        <w:rPr>
+          <w:lang w:val="en-US"/>
+        </w:rPr>
+        <w:t>have</w:t>
+      </w:r>
+      <w:r>
+        <w:rPr>
+          <w:lang w:val="en-US"/>
+        </w:rPr>
+        <w:t xml:space="preserve"> material issue and material </w:t>
+      </w:r>
+      <w:r>
+        <w:rPr>
+          <w:lang w:val="en-US"/>
+        </w:rPr>
+        <w:t xml:space="preserve">return </w:t>
+      </w:r>
+      <w:proofErr w:type="gramStart"/>
+      <w:r>
+        <w:rPr>
+          <w:lang w:val="en-US"/>
+        </w:rPr>
+        <w:t>part  don’t</w:t>
+      </w:r>
+      <w:proofErr w:type="gramEnd"/>
+      <w:r>
+        <w:rPr>
+          <w:lang w:val="en-US"/>
+        </w:rPr>
+        <w:t xml:space="preserve"> need</w:t>
+      </w:r>
+      <w:r>
+        <w:rPr>
+          <w:lang w:val="en-US"/>
+        </w:rPr>
+        <w:t xml:space="preserve"> in the work order creation screen</w:t>
+      </w:r>
+      <w:r>
+        <w:rPr>
+          <w:lang w:val="en-US"/>
+        </w:rPr>
+        <w:t xml:space="preserve">, </w:t>
+      </w:r>
+    </w:p>
+    <w:p>
+      <w:pPr>
+        <w:pStyle w:val="NoSpacing"/>
+        <w:ind w:left="1080"/>
+        <w:rPr>
+          <w:lang w:val="en-US"/>
+        </w:rPr>
+      </w:pPr>
+      <w:r>
+        <w:rPr>
+          <w:lang w:val="en-US"/>
+        </w:rPr>
+        <w:t xml:space="preserve">2. </w:t>
+      </w:r>
+      <w:r>
+        <w:rPr>
+          <w:lang w:val="en-US"/>
+        </w:rPr>
+        <w:t xml:space="preserve">After completed and saved the work items </w:t>
+      </w:r>
+    </w:p>
+    <w:p>
+      <w:pPr>
+        <w:pStyle w:val="NoSpacing"/>
+        <w:ind w:left="1080"/>
+        <w:rPr>
+          <w:lang w:val="en-US"/>
+        </w:rPr>
+      </w:pPr>
+      <w:r>
+        <w:rPr>
+          <w:lang w:val="en-US"/>
+        </w:rPr>
+        <w:t xml:space="preserve">3. </w:t>
+      </w:r>
+      <w:r>
+        <w:rPr>
+          <w:lang w:val="en-US"/>
+        </w:rPr>
+        <w:t xml:space="preserve">Material issue menu should enable </w:t>
+      </w:r>
+      <w:r>
+        <w:rPr>
+          <w:lang w:val="en-US"/>
+        </w:rPr>
+        <w:t>in the work order list action menu list</w:t>
+      </w:r>
+    </w:p>
+    <w:p>
+      <w:pPr>
+        <w:pStyle w:val="NoSpacing"/>
+        <w:ind w:left="1080"/>
+        <w:rPr>
+          <w:lang w:val="en-US"/>
+        </w:rPr>
+      </w:pPr>
+      <w:r>
+        <w:rPr>
+          <w:lang w:val="en-US"/>
+        </w:rPr>
+        <w:t>4.</w:t>
+      </w:r>
+      <w:r>
+        <w:rPr>
+          <w:lang w:val="en-US"/>
+        </w:rPr>
+        <w:t xml:space="preserve">It </w:t>
+      </w:r>
+      <w:r>
+        <w:rPr>
+          <w:lang w:val="en-US"/>
+        </w:rPr>
+        <w:t>go</w:t>
+      </w:r>
+      <w:r>
+        <w:rPr>
+          <w:lang w:val="en-US"/>
+        </w:rPr>
+        <w:t xml:space="preserve"> to a new screen to material issue, </w:t>
+      </w:r>
+      <w:r>
+        <w:rPr>
+          <w:lang w:val="en-US"/>
+        </w:rPr>
+        <w:t xml:space="preserve">In the header </w:t>
+      </w:r>
+      <w:proofErr w:type="gramStart"/>
+      <w:r>
+        <w:rPr>
+          <w:lang w:val="en-US"/>
+        </w:rPr>
+        <w:t>widget ,</w:t>
+      </w:r>
+      <w:proofErr w:type="gramEnd"/>
+      <w:r>
+        <w:rPr>
+          <w:lang w:val="en-US"/>
+        </w:rPr>
+        <w:t xml:space="preserve"> can show the work order details </w:t>
+      </w:r>
+      <w:r>
+        <w:rPr>
+          <w:lang w:val="en-US"/>
+        </w:rPr>
+        <w:t>as</w:t>
+      </w:r>
+      <w:r>
+        <w:rPr>
+          <w:lang w:val="en-US"/>
+        </w:rPr>
+        <w:t xml:space="preserve"> display </w:t>
+      </w:r>
+      <w:r>
+        <w:rPr>
+          <w:lang w:val="en-US"/>
+        </w:rPr>
+        <w:t>field</w:t>
+      </w:r>
+    </w:p>
+    <w:p>
+      <w:pPr>
+        <w:pStyle w:val="NoSpacing"/>
+        <w:ind w:left="1080"/>
+        <w:rPr>
+          <w:lang w:val="en-US"/>
+        </w:rPr>
+      </w:pPr>
+      <w:r>
+        <w:rPr>
+          <w:lang w:val="en-US"/>
+        </w:rPr>
+        <w:t>5.</w:t>
+      </w:r>
+      <w:r>
+        <w:rPr>
+          <w:lang w:val="en-US"/>
+        </w:rPr>
+        <w:t xml:space="preserve">In the material issue list below </w:t>
+      </w:r>
+      <w:r>
+        <w:rPr>
+          <w:lang w:val="en-US"/>
+        </w:rPr>
+        <w:t xml:space="preserve">can </w:t>
+      </w:r>
+      <w:r>
+        <w:rPr>
+          <w:lang w:val="en-US"/>
+        </w:rPr>
+        <w:t xml:space="preserve">show the </w:t>
+      </w:r>
+      <w:r>
+        <w:rPr>
+          <w:lang w:val="en-US"/>
+        </w:rPr>
+        <w:t>material return area</w:t>
+      </w:r>
+    </w:p>
+    <w:p>
+      <w:pPr>
+        <w:pStyle w:val="NoSpacing"/>
+        <w:ind w:left="1080"/>
+        <w:rPr>
+          <w:lang w:val="en-US"/>
+        </w:rPr>
+      </w:pPr>
+      <w:r>
+        <w:rPr>
+          <w:lang w:val="en-US"/>
+        </w:rPr>
+        <w:t>6.</w:t>
+      </w:r>
+      <w:r>
+        <w:rPr>
+          <w:lang w:val="en-US"/>
+        </w:rPr>
+        <w:t xml:space="preserve"> In the </w:t>
+      </w:r>
+      <w:r>
+        <w:rPr>
+          <w:lang w:val="en-US"/>
+        </w:rPr>
+        <w:t xml:space="preserve">material </w:t>
+      </w:r>
+      <w:r>
+        <w:rPr>
+          <w:lang w:val="en-US"/>
+        </w:rPr>
+        <w:t xml:space="preserve">issue row need to add a button “Return” when we click the </w:t>
+      </w:r>
+      <w:proofErr w:type="spellStart"/>
+      <w:r>
+        <w:rPr>
+          <w:lang w:val="en-US"/>
+        </w:rPr>
+        <w:t>the</w:t>
+      </w:r>
+      <w:proofErr w:type="spellEnd"/>
+      <w:r>
+        <w:rPr>
+          <w:lang w:val="en-US"/>
+        </w:rPr>
+        <w:t xml:space="preserve"> button </w:t>
+      </w:r>
+      <w:r>
+        <w:rPr>
+          <w:lang w:val="en-US"/>
+        </w:rPr>
+        <w:t>same material should add in material return row without qty, user can fill the qty and other details</w:t>
+      </w:r>
+    </w:p>
+    <w:p>
+      <w:pPr>
+        <w:pStyle w:val="NoSpacing"/>
+        <w:ind w:left="1080"/>
+        <w:rPr>
+          <w:lang w:val="en-US"/>
+        </w:rPr>
+      </w:pPr>
+    </w:p>
+    <w:p>
+      <w:pPr>
+        <w:pStyle w:val="NoSpacing"/>
+        <w:numPr>
+          <w:ilvl w:val="1"/>
+          <w:numId w:val="19"/>
+        </w:numPr>
+        <w:rPr>
+          <w:b/>
+          <w:bCs/>
+          <w:lang w:val="en-US"/>
+        </w:rPr>
+      </w:pPr>
+      <w:r>
+        <w:rPr>
+          <w:b/>
+          <w:bCs/>
+          <w:lang w:val="en-US"/>
+        </w:rPr>
+        <w:t>Issue Material</w:t>
+      </w:r>
+      <w:r>
+        <w:rPr>
+          <w:b/>
+          <w:bCs/>
+          <w:lang w:val="en-US"/>
+        </w:rPr>
+        <w:t xml:space="preserve"> is not required </w:t>
+      </w:r>
+    </w:p>
+    <w:p>
+      <w:pPr>
+        <w:pStyle w:val="NoSpacing"/>
+        <w:numPr>
+          <w:ilvl w:val="1"/>
+          <w:numId w:val="19"/>
+        </w:numPr>
+        <w:rPr>
+          <w:b/>
+          <w:bCs/>
+          <w:lang w:val="en-US"/>
+        </w:rPr>
+      </w:pPr>
+      <w:r>
+        <w:rPr>
+          <w:b/>
+          <w:bCs/>
+          <w:lang w:val="en-US"/>
+        </w:rPr>
+        <w:t>Material issue list should fetch all “</w:t>
+      </w:r>
+      <w:proofErr w:type="spellStart"/>
+      <w:r>
+        <w:rPr>
+          <w:b/>
+          <w:bCs/>
+          <w:lang w:val="en-US"/>
+        </w:rPr>
+        <w:t>product_type</w:t>
+      </w:r>
+      <w:proofErr w:type="spellEnd"/>
+      <w:r>
+        <w:rPr>
+          <w:b/>
+          <w:bCs/>
+          <w:lang w:val="en-US"/>
+        </w:rPr>
+        <w:t xml:space="preserve"> = material” here </w:t>
+      </w:r>
+    </w:p>
+    <w:p>
+      <w:pPr>
+        <w:pStyle w:val="NoSpacing"/>
+        <w:numPr>
+          <w:ilvl w:val="1"/>
+          <w:numId w:val="19"/>
+        </w:numPr>
+        <w:rPr>
+          <w:b/>
+          <w:bCs/>
+          <w:lang w:val="en-US"/>
+        </w:rPr>
+      </w:pPr>
+      <w:r>
+        <w:rPr>
+          <w:b/>
+          <w:bCs/>
+          <w:lang w:val="en-US"/>
+        </w:rPr>
+        <w:t>If want to add new row, need a button at bottom of table “Add Material”</w:t>
+      </w:r>
+    </w:p>
+    <w:p>
+      <w:pPr>
+        <w:pStyle w:val="NoSpacing"/>
+        <w:ind w:left="1440"/>
+        <w:rPr>
+          <w:b/>
+          <w:bCs/>
+          <w:lang w:val="en-US"/>
+        </w:rPr>
+      </w:pPr>
+    </w:p>
+    <w:p>
+      <w:pPr>
+        <w:pStyle w:val="NoSpacing"/>
+        <w:ind w:left="1440"/>
+        <w:rPr>
+          <w:b/>
+          <w:bCs/>
+          <w:lang w:val="en-US"/>
+        </w:rPr>
+      </w:pPr>
+      <w:r>
+        <w:rPr>
+          <w:b/>
+          <w:bCs/>
+          <w:lang w:val="en-US"/>
+        </w:rPr>
+        <w:t xml:space="preserve">Use reusable components all the forms as like brand, product </w:t>
+      </w:r>
+    </w:p>
+    <w:p>
+      <w:pPr>
+        <w:pStyle w:val="NoSpacing"/>
+        <w:ind w:left="1440"/>
+        <w:rPr>
+          <w:b/>
+          <w:bCs/>
+          <w:lang w:val="en-US"/>
+        </w:rPr>
+      </w:pPr>
+    </w:p>
+    <w:p>
+      <w:pPr>
+        <w:pStyle w:val="NoSpacing"/>
+        <w:ind w:left="1440"/>
+        <w:rPr>
+          <w:b/>
+          <w:bCs/>
+          <w:lang w:val="en-US"/>
+        </w:rPr>
+      </w:pPr>
+    </w:p>
+    <w:tbl>
+      <w:tblPr>
+        <w:tblStyle w:val="TableGrid"/>
+        <w:tblW w:w="0" w:type="auto"/>
+        <w:tblInd w:w="1440" w:type="dxa"/>
+        <w:tblLook w:val="04A0" w:firstRow="1" w:lastRow="0" w:firstColumn="1" w:lastColumn="0" w:noHBand="0" w:noVBand="1"/>
+      </w:tblPr>
+      <w:tblGrid>
+        <w:gridCol w:w="7576"/>
+      </w:tblGrid>
+      <w:tr>
+        <w:tc>
+          <w:tcPr>
+            <w:tcW w:w="7576" w:type="dxa"/>
+          </w:tcPr>
+          <w:tbl>
+            <w:tblPr>
+              <w:tblW w:w="10068" w:type="dxa"/>
+              <w:shd w:val="clear" w:color="auto" w:fill="FFFFFF"/>
+              <w:tblCellMar>
+                <w:top w:w="15" w:type="dxa"/>
+                <w:left w:w="15" w:type="dxa"/>
+                <w:bottom w:w="15" w:type="dxa"/>
+                <w:right w:w="15" w:type="dxa"/>
+              </w:tblCellMar>
+              <w:tblLook w:val="04A0" w:firstRow="1" w:lastRow="0" w:firstColumn="1" w:lastColumn="0" w:noHBand="0" w:noVBand="1"/>
+            </w:tblPr>
+            <w:tblGrid>
+              <w:gridCol w:w="4227"/>
+              <w:gridCol w:w="2584"/>
+              <w:gridCol w:w="3257"/>
+            </w:tblGrid>
+            <w:tr>
+              <w:tc>
+                <w:tcPr>
+                  <w:tcW w:w="0" w:type="auto"/>
+                  <w:tcBorders>
+                    <w:top w:val="nil"/>
+                    <w:left w:val="nil"/>
+                    <w:bottom w:val="nil"/>
+                    <w:right w:val="nil"/>
+                  </w:tcBorders>
+                  <w:shd w:val="clear" w:color="auto" w:fill="FFFFFF"/>
+                  <w:vAlign w:val="center"/>
+                  <w:hideMark/>
+                </w:tcPr>
+                <w:p>
+                  <w:pPr>
+                    <w:spacing w:after="0" w:line="240" w:lineRule="auto"/>
+                    <w:rPr>
+                      <w:rFonts w:ascii="Inter Fallback" w:eastAsia="Times New Roman" w:hAnsi="Inter Fallback" w:cs="Times New Roman"/>
+                      <w:color w:val="373737"/>
+                      <w:kern w:val="0"/>
+                      <w:lang w:val="en-US"/>
+                      <w14:ligatures w14:val="none"/>
+                    </w:rPr>
+                  </w:pPr>
+                  <w:r>
+                    <w:rPr>
+                      <w:rFonts w:ascii="Inter Fallback" w:eastAsia="Times New Roman" w:hAnsi="Inter Fallback" w:cs="Times New Roman"/>
+                      <w:b/>
+                      <w:bCs/>
+                      <w:color w:val="373737"/>
+                      <w:kern w:val="0"/>
+                      <w:bdr w:val="single" w:sz="2" w:space="0" w:color="E5E7EB" w:frame="1"/>
+                      <w:lang w:val="en-US"/>
+                      <w14:ligatures w14:val="none"/>
+                    </w:rPr>
+                    <w:t>Asian Paints Tractor Emulsion</w:t>
+                  </w:r>
+                </w:p>
+              </w:tc>
+              <w:tc>
+                <w:tcPr>
+                  <w:tcW w:w="0" w:type="auto"/>
+                  <w:tcBorders>
+                    <w:top w:val="nil"/>
+                    <w:left w:val="nil"/>
+                    <w:bottom w:val="nil"/>
+                    <w:right w:val="nil"/>
+                  </w:tcBorders>
+                  <w:shd w:val="clear" w:color="auto" w:fill="FFFFFF"/>
+                  <w:vAlign w:val="center"/>
+                  <w:hideMark/>
+                </w:tcPr>
+                <w:p>
+                  <w:pPr>
+                    <w:spacing w:after="0" w:line="240" w:lineRule="auto"/>
+                    <w:rPr>
+                      <w:rFonts w:ascii="Inter Fallback" w:eastAsia="Times New Roman" w:hAnsi="Inter Fallback" w:cs="Times New Roman"/>
+                      <w:color w:val="373737"/>
+                      <w:kern w:val="0"/>
+                      <w:lang w:val="en-US"/>
+                      <w14:ligatures w14:val="none"/>
+                    </w:rPr>
+                  </w:pPr>
+                  <w:r>
+                    <w:rPr>
+                      <w:rFonts w:ascii="Inter Fallback" w:eastAsia="Times New Roman" w:hAnsi="Inter Fallback" w:cs="Times New Roman"/>
+                      <w:color w:val="373737"/>
+                      <w:kern w:val="0"/>
+                      <w:lang w:val="en-US"/>
+                      <w14:ligatures w14:val="none"/>
+                    </w:rPr>
+                    <w:t>Budget emulsion</w:t>
+                  </w:r>
+                </w:p>
+              </w:tc>
+              <w:tc>
+                <w:tcPr>
+                  <w:tcW w:w="0" w:type="auto"/>
+                  <w:tcBorders>
+                    <w:top w:val="nil"/>
+                    <w:left w:val="nil"/>
+                    <w:bottom w:val="nil"/>
+                    <w:right w:val="nil"/>
+                  </w:tcBorders>
+                  <w:shd w:val="clear" w:color="auto" w:fill="FFFFFF"/>
+                  <w:vAlign w:val="center"/>
+                  <w:hideMark/>
+                </w:tcPr>
+                <w:p>
+                  <w:pPr>
+                    <w:spacing w:after="0" w:line="240" w:lineRule="auto"/>
+                    <w:rPr>
+                      <w:rFonts w:ascii="Inter Fallback" w:eastAsia="Times New Roman" w:hAnsi="Inter Fallback" w:cs="Times New Roman"/>
+                      <w:color w:val="373737"/>
+                      <w:kern w:val="0"/>
+                      <w:lang w:val="en-US"/>
+                      <w14:ligatures w14:val="none"/>
+                    </w:rPr>
+                  </w:pPr>
+                  <w:r>
+                    <w:rPr>
+                      <w:rFonts w:ascii="Inter Fallback" w:eastAsia="Times New Roman" w:hAnsi="Inter Fallback" w:cs="Times New Roman"/>
+                      <w:b/>
+                      <w:bCs/>
+                      <w:color w:val="373737"/>
+                      <w:kern w:val="0"/>
+                      <w:bdr w:val="single" w:sz="2" w:space="0" w:color="E5E7EB" w:frame="1"/>
+                      <w:lang w:val="en-US"/>
+                      <w14:ligatures w14:val="none"/>
+                    </w:rPr>
+                    <w:t>₹130-180/L</w:t>
+                  </w:r>
+                  <w:r>
+                    <w:rPr>
+                      <w:rFonts w:ascii="Inter Fallback" w:eastAsia="Times New Roman" w:hAnsi="Inter Fallback" w:cs="Times New Roman"/>
+                      <w:color w:val="373737"/>
+                      <w:kern w:val="0"/>
+                      <w:lang w:val="en-US"/>
+                      <w14:ligatures w14:val="none"/>
+                    </w:rPr>
+                    <w:t> </w:t>
+                  </w:r>
+                  <w:hyperlink r:id="rId6" w:tgtFrame="_blank" w:history="1">
+                    <w:r>
+                      <w:rPr>
+                        <w:rFonts w:ascii="Inter Fallback" w:eastAsia="Times New Roman" w:hAnsi="Inter Fallback" w:cs="Times New Roman"/>
+                        <w:color w:val="0000FF"/>
+                        <w:kern w:val="0"/>
+                        <w:bdr w:val="single" w:sz="2" w:space="0" w:color="E5E7EB" w:frame="1"/>
+                        <w:shd w:val="clear" w:color="auto" w:fill="F9F9F9"/>
+                        <w:lang w:val="en-US"/>
+                        <w14:ligatures w14:val="none"/>
+                      </w:rPr>
+                      <w:t>nobroker.in</w:t>
+                    </w:r>
+                  </w:hyperlink>
+                </w:p>
+              </w:tc>
+            </w:tr>
+            <w:tr>
+              <w:tc>
+                <w:tcPr>
+                  <w:tcW w:w="0" w:type="auto"/>
+                  <w:tcBorders>
+                    <w:top w:val="nil"/>
+                    <w:left w:val="nil"/>
+                    <w:bottom w:val="nil"/>
+                    <w:right w:val="nil"/>
+                  </w:tcBorders>
+                  <w:shd w:val="clear" w:color="auto" w:fill="FFFFFF"/>
+                  <w:vAlign w:val="center"/>
+                  <w:hideMark/>
+                </w:tcPr>
+                <w:p>
+                  <w:pPr>
+                    <w:spacing w:after="0" w:line="240" w:lineRule="auto"/>
+                    <w:rPr>
+                      <w:rFonts w:ascii="Inter Fallback" w:eastAsia="Times New Roman" w:hAnsi="Inter Fallback" w:cs="Times New Roman"/>
+                      <w:color w:val="373737"/>
+                      <w:kern w:val="0"/>
+                      <w:lang w:val="en-US"/>
+                      <w14:ligatures w14:val="none"/>
+                    </w:rPr>
+                  </w:pPr>
+                  <w:proofErr w:type="spellStart"/>
+                  <w:r>
+                    <w:rPr>
+                      <w:rFonts w:ascii="Inter Fallback" w:eastAsia="Times New Roman" w:hAnsi="Inter Fallback" w:cs="Times New Roman"/>
+                      <w:b/>
+                      <w:bCs/>
+                      <w:color w:val="373737"/>
+                      <w:kern w:val="0"/>
+                      <w:bdr w:val="single" w:sz="2" w:space="0" w:color="E5E7EB" w:frame="1"/>
+                      <w:lang w:val="en-US"/>
+                      <w14:ligatures w14:val="none"/>
+                    </w:rPr>
+                    <w:t>Apcolite</w:t>
+                  </w:r>
+                  <w:proofErr w:type="spellEnd"/>
+                  <w:r>
+                    <w:rPr>
+                      <w:rFonts w:ascii="Inter Fallback" w:eastAsia="Times New Roman" w:hAnsi="Inter Fallback" w:cs="Times New Roman"/>
+                      <w:b/>
+                      <w:bCs/>
+                      <w:color w:val="373737"/>
+                      <w:kern w:val="0"/>
+                      <w:bdr w:val="single" w:sz="2" w:space="0" w:color="E5E7EB" w:frame="1"/>
+                      <w:lang w:val="en-US"/>
+                      <w14:ligatures w14:val="none"/>
+                    </w:rPr>
+                    <w:t xml:space="preserve"> Premium Emulsion</w:t>
+                  </w:r>
+                </w:p>
+              </w:tc>
+              <w:tc>
+                <w:tcPr>
+                  <w:tcW w:w="0" w:type="auto"/>
+                  <w:tcBorders>
+                    <w:top w:val="nil"/>
+                    <w:left w:val="nil"/>
+                    <w:bottom w:val="nil"/>
+                    <w:right w:val="nil"/>
+                  </w:tcBorders>
+                  <w:shd w:val="clear" w:color="auto" w:fill="FFFFFF"/>
+                  <w:vAlign w:val="center"/>
+                  <w:hideMark/>
+                </w:tcPr>
+                <w:p>
+                  <w:pPr>
+                    <w:spacing w:after="0" w:line="240" w:lineRule="auto"/>
+                    <w:rPr>
+                      <w:rFonts w:ascii="Inter Fallback" w:eastAsia="Times New Roman" w:hAnsi="Inter Fallback" w:cs="Times New Roman"/>
+                      <w:color w:val="373737"/>
+                      <w:kern w:val="0"/>
+                      <w:lang w:val="en-US"/>
+                      <w14:ligatures w14:val="none"/>
+                    </w:rPr>
+                  </w:pPr>
+                  <w:r>
+                    <w:rPr>
+                      <w:rFonts w:ascii="Inter Fallback" w:eastAsia="Times New Roman" w:hAnsi="Inter Fallback" w:cs="Times New Roman"/>
+                      <w:color w:val="373737"/>
+                      <w:kern w:val="0"/>
+                      <w:lang w:val="en-US"/>
+                      <w14:ligatures w14:val="none"/>
+                    </w:rPr>
+                    <w:t>Mid-range emulsion</w:t>
+                  </w:r>
+                </w:p>
+              </w:tc>
+              <w:tc>
+                <w:tcPr>
+                  <w:tcW w:w="0" w:type="auto"/>
+                  <w:tcBorders>
+                    <w:top w:val="nil"/>
+                    <w:left w:val="nil"/>
+                    <w:bottom w:val="nil"/>
+                    <w:right w:val="nil"/>
+                  </w:tcBorders>
+                  <w:shd w:val="clear" w:color="auto" w:fill="FFFFFF"/>
+                  <w:vAlign w:val="center"/>
+                  <w:hideMark/>
+                </w:tcPr>
+                <w:p>
+                  <w:pPr>
+                    <w:spacing w:after="0" w:line="240" w:lineRule="auto"/>
+                    <w:rPr>
+                      <w:rFonts w:ascii="Inter Fallback" w:eastAsia="Times New Roman" w:hAnsi="Inter Fallback" w:cs="Times New Roman"/>
+                      <w:color w:val="373737"/>
+                      <w:kern w:val="0"/>
+                      <w:lang w:val="en-US"/>
+                      <w14:ligatures w14:val="none"/>
+                    </w:rPr>
+                  </w:pPr>
+                  <w:r>
+                    <w:rPr>
+                      <w:rFonts w:ascii="Inter Fallback" w:eastAsia="Times New Roman" w:hAnsi="Inter Fallback" w:cs="Times New Roman"/>
+                      <w:b/>
+                      <w:bCs/>
+                      <w:color w:val="373737"/>
+                      <w:kern w:val="0"/>
+                      <w:bdr w:val="single" w:sz="2" w:space="0" w:color="E5E7EB" w:frame="1"/>
+                      <w:lang w:val="en-US"/>
+                      <w14:ligatures w14:val="none"/>
+                    </w:rPr>
+                    <w:t>₹250-300/L</w:t>
+                  </w:r>
+                  <w:r>
+                    <w:rPr>
+                      <w:rFonts w:ascii="Inter Fallback" w:eastAsia="Times New Roman" w:hAnsi="Inter Fallback" w:cs="Times New Roman"/>
+                      <w:color w:val="373737"/>
+                      <w:kern w:val="0"/>
+                      <w:lang w:val="en-US"/>
+                      <w14:ligatures w14:val="none"/>
+                    </w:rPr>
+                    <w:t> </w:t>
+                  </w:r>
+                  <w:hyperlink r:id="rId7" w:tgtFrame="_blank" w:history="1">
+                    <w:r>
+                      <w:rPr>
+                        <w:rFonts w:ascii="Inter Fallback" w:eastAsia="Times New Roman" w:hAnsi="Inter Fallback" w:cs="Times New Roman"/>
+                        <w:color w:val="0000FF"/>
+                        <w:kern w:val="0"/>
+                        <w:bdr w:val="single" w:sz="2" w:space="0" w:color="E5E7EB" w:frame="1"/>
+                        <w:shd w:val="clear" w:color="auto" w:fill="F9F9F9"/>
+                        <w:lang w:val="en-US"/>
+                        <w14:ligatures w14:val="none"/>
+                      </w:rPr>
+                      <w:t>nobroker.in</w:t>
+                    </w:r>
+                  </w:hyperlink>
+                </w:p>
+              </w:tc>
+            </w:tr>
+            <w:tr>
+              <w:tc>
+                <w:tcPr>
+                  <w:tcW w:w="0" w:type="auto"/>
+                  <w:tcBorders>
+                    <w:top w:val="nil"/>
+                    <w:left w:val="nil"/>
+                    <w:bottom w:val="nil"/>
+                    <w:right w:val="nil"/>
+                  </w:tcBorders>
+                  <w:shd w:val="clear" w:color="auto" w:fill="FFFFFF"/>
+                  <w:vAlign w:val="center"/>
+                  <w:hideMark/>
+                </w:tcPr>
+                <w:p>
+                  <w:pPr>
+                    <w:spacing w:after="0" w:line="240" w:lineRule="auto"/>
+                    <w:rPr>
+                      <w:rFonts w:ascii="Inter Fallback" w:eastAsia="Times New Roman" w:hAnsi="Inter Fallback" w:cs="Times New Roman"/>
+                      <w:color w:val="373737"/>
+                      <w:kern w:val="0"/>
+                      <w:lang w:val="en-US"/>
+                      <w14:ligatures w14:val="none"/>
+                    </w:rPr>
+                  </w:pPr>
+                  <w:r>
+                    <w:rPr>
+                      <w:rFonts w:ascii="Inter Fallback" w:eastAsia="Times New Roman" w:hAnsi="Inter Fallback" w:cs="Times New Roman"/>
+                      <w:b/>
+                      <w:bCs/>
+                      <w:color w:val="373737"/>
+                      <w:kern w:val="0"/>
+                      <w:bdr w:val="single" w:sz="2" w:space="0" w:color="E5E7EB" w:frame="1"/>
+                      <w:lang w:val="en-US"/>
+                      <w14:ligatures w14:val="none"/>
+                    </w:rPr>
+                    <w:t xml:space="preserve">Dulux </w:t>
+                  </w:r>
+                  <w:proofErr w:type="spellStart"/>
+                  <w:r>
+                    <w:rPr>
+                      <w:rFonts w:ascii="Inter Fallback" w:eastAsia="Times New Roman" w:hAnsi="Inter Fallback" w:cs="Times New Roman"/>
+                      <w:b/>
+                      <w:bCs/>
+                      <w:color w:val="373737"/>
+                      <w:kern w:val="0"/>
+                      <w:bdr w:val="single" w:sz="2" w:space="0" w:color="E5E7EB" w:frame="1"/>
+                      <w:lang w:val="en-US"/>
+                      <w14:ligatures w14:val="none"/>
+                    </w:rPr>
+                    <w:t>SuperCover</w:t>
+                  </w:r>
+                  <w:proofErr w:type="spellEnd"/>
+                </w:p>
+              </w:tc>
+              <w:tc>
+                <w:tcPr>
+                  <w:tcW w:w="0" w:type="auto"/>
+                  <w:tcBorders>
+                    <w:top w:val="nil"/>
+                    <w:left w:val="nil"/>
+                    <w:bottom w:val="nil"/>
+                    <w:right w:val="nil"/>
+                  </w:tcBorders>
+                  <w:shd w:val="clear" w:color="auto" w:fill="FFFFFF"/>
+                  <w:vAlign w:val="center"/>
+                  <w:hideMark/>
+                </w:tcPr>
+                <w:p>
+                  <w:pPr>
+                    <w:spacing w:after="0" w:line="240" w:lineRule="auto"/>
+                    <w:rPr>
+                      <w:rFonts w:ascii="Inter Fallback" w:eastAsia="Times New Roman" w:hAnsi="Inter Fallback" w:cs="Times New Roman"/>
+                      <w:color w:val="373737"/>
+                      <w:kern w:val="0"/>
+                      <w:lang w:val="en-US"/>
+                      <w14:ligatures w14:val="none"/>
+                    </w:rPr>
+                  </w:pPr>
+                  <w:r>
+                    <w:rPr>
+                      <w:rFonts w:ascii="Inter Fallback" w:eastAsia="Times New Roman" w:hAnsi="Inter Fallback" w:cs="Times New Roman"/>
+                      <w:color w:val="373737"/>
+                      <w:kern w:val="0"/>
+                      <w:lang w:val="en-US"/>
+                      <w14:ligatures w14:val="none"/>
+                    </w:rPr>
+                    <w:t>Economy emulsion</w:t>
+                  </w:r>
+                </w:p>
+              </w:tc>
+              <w:tc>
+                <w:tcPr>
+                  <w:tcW w:w="0" w:type="auto"/>
+                  <w:tcBorders>
+                    <w:top w:val="nil"/>
+                    <w:left w:val="nil"/>
+                    <w:bottom w:val="nil"/>
+                    <w:right w:val="nil"/>
+                  </w:tcBorders>
+                  <w:shd w:val="clear" w:color="auto" w:fill="FFFFFF"/>
+                  <w:vAlign w:val="center"/>
+                  <w:hideMark/>
+                </w:tcPr>
+                <w:p>
+                  <w:pPr>
+                    <w:spacing w:after="0" w:line="240" w:lineRule="auto"/>
+                    <w:rPr>
+                      <w:rFonts w:ascii="Inter Fallback" w:eastAsia="Times New Roman" w:hAnsi="Inter Fallback" w:cs="Times New Roman"/>
+                      <w:color w:val="373737"/>
+                      <w:kern w:val="0"/>
+                      <w:lang w:val="en-US"/>
+                      <w14:ligatures w14:val="none"/>
+                    </w:rPr>
+                  </w:pPr>
+                  <w:r>
+                    <w:rPr>
+                      <w:rFonts w:ascii="Inter Fallback" w:eastAsia="Times New Roman" w:hAnsi="Inter Fallback" w:cs="Times New Roman"/>
+                      <w:b/>
+                      <w:bCs/>
+                      <w:color w:val="373737"/>
+                      <w:kern w:val="0"/>
+                      <w:bdr w:val="single" w:sz="2" w:space="0" w:color="E5E7EB" w:frame="1"/>
+                      <w:lang w:val="en-US"/>
+                      <w14:ligatures w14:val="none"/>
+                    </w:rPr>
+                    <w:t>₹160-200/L</w:t>
+                  </w:r>
+                  <w:r>
+                    <w:rPr>
+                      <w:rFonts w:ascii="Inter Fallback" w:eastAsia="Times New Roman" w:hAnsi="Inter Fallback" w:cs="Times New Roman"/>
+                      <w:color w:val="373737"/>
+                      <w:kern w:val="0"/>
+                      <w:lang w:val="en-US"/>
+                      <w14:ligatures w14:val="none"/>
+                    </w:rPr>
+                    <w:t> </w:t>
+                  </w:r>
+                  <w:hyperlink r:id="rId8" w:tgtFrame="_blank" w:history="1">
+                    <w:r>
+                      <w:rPr>
+                        <w:rFonts w:ascii="Inter Fallback" w:eastAsia="Times New Roman" w:hAnsi="Inter Fallback" w:cs="Times New Roman"/>
+                        <w:color w:val="0000FF"/>
+                        <w:kern w:val="0"/>
+                        <w:bdr w:val="single" w:sz="2" w:space="0" w:color="E5E7EB" w:frame="1"/>
+                        <w:shd w:val="clear" w:color="auto" w:fill="F9F9F9"/>
+                        <w:lang w:val="en-US"/>
+                        <w14:ligatures w14:val="none"/>
+                      </w:rPr>
+                      <w:t>nobroker.in</w:t>
+                    </w:r>
+                  </w:hyperlink>
+                </w:p>
+              </w:tc>
+            </w:tr>
+            <w:tr>
+              <w:tc>
+                <w:tcPr>
+                  <w:tcW w:w="0" w:type="auto"/>
+                  <w:tcBorders>
+                    <w:top w:val="nil"/>
+                    <w:left w:val="nil"/>
+                    <w:bottom w:val="nil"/>
+                    <w:right w:val="nil"/>
+                  </w:tcBorders>
+                  <w:shd w:val="clear" w:color="auto" w:fill="FFFFFF"/>
+                  <w:vAlign w:val="center"/>
+                  <w:hideMark/>
+                </w:tcPr>
+                <w:p>
+                  <w:pPr>
+                    <w:spacing w:after="0" w:line="240" w:lineRule="auto"/>
+                    <w:rPr>
+                      <w:rFonts w:ascii="Inter Fallback" w:eastAsia="Times New Roman" w:hAnsi="Inter Fallback" w:cs="Times New Roman"/>
+                      <w:color w:val="373737"/>
+                      <w:kern w:val="0"/>
+                      <w:lang w:val="en-US"/>
+                      <w14:ligatures w14:val="none"/>
+                    </w:rPr>
+                  </w:pPr>
+                  <w:r>
+                    <w:rPr>
+                      <w:rFonts w:ascii="Inter Fallback" w:eastAsia="Times New Roman" w:hAnsi="Inter Fallback" w:cs="Times New Roman"/>
+                      <w:b/>
+                      <w:bCs/>
+                      <w:color w:val="373737"/>
+                      <w:kern w:val="0"/>
+                      <w:bdr w:val="single" w:sz="2" w:space="0" w:color="E5E7EB" w:frame="1"/>
+                      <w:lang w:val="en-US"/>
+                      <w14:ligatures w14:val="none"/>
+                    </w:rPr>
+                    <w:t>Berger Easy Clean</w:t>
+                  </w:r>
+                </w:p>
+              </w:tc>
+              <w:tc>
+                <w:tcPr>
+                  <w:tcW w:w="0" w:type="auto"/>
+                  <w:tcBorders>
+                    <w:top w:val="nil"/>
+                    <w:left w:val="nil"/>
+                    <w:bottom w:val="nil"/>
+                    <w:right w:val="nil"/>
+                  </w:tcBorders>
+                  <w:shd w:val="clear" w:color="auto" w:fill="FFFFFF"/>
+                  <w:vAlign w:val="center"/>
+                  <w:hideMark/>
+                </w:tcPr>
+                <w:p>
+                  <w:pPr>
+                    <w:spacing w:after="0" w:line="240" w:lineRule="auto"/>
+                    <w:rPr>
+                      <w:rFonts w:ascii="Inter Fallback" w:eastAsia="Times New Roman" w:hAnsi="Inter Fallback" w:cs="Times New Roman"/>
+                      <w:color w:val="373737"/>
+                      <w:kern w:val="0"/>
+                      <w:lang w:val="en-US"/>
+                      <w14:ligatures w14:val="none"/>
+                    </w:rPr>
+                  </w:pPr>
+                  <w:r>
+                    <w:rPr>
+                      <w:rFonts w:ascii="Inter Fallback" w:eastAsia="Times New Roman" w:hAnsi="Inter Fallback" w:cs="Times New Roman"/>
+                      <w:color w:val="373737"/>
+                      <w:kern w:val="0"/>
+                      <w:lang w:val="en-US"/>
+                      <w14:ligatures w14:val="none"/>
+                    </w:rPr>
+                    <w:t>Premium emulsion</w:t>
+                  </w:r>
+                </w:p>
+              </w:tc>
+              <w:tc>
+                <w:tcPr>
+                  <w:tcW w:w="0" w:type="auto"/>
+                  <w:tcBorders>
+                    <w:top w:val="nil"/>
+                    <w:left w:val="nil"/>
+                    <w:bottom w:val="nil"/>
+                    <w:right w:val="nil"/>
+                  </w:tcBorders>
+                  <w:shd w:val="clear" w:color="auto" w:fill="FFFFFF"/>
+                  <w:vAlign w:val="center"/>
+                  <w:hideMark/>
+                </w:tcPr>
+                <w:p>
+                  <w:pPr>
+                    <w:spacing w:after="0" w:line="240" w:lineRule="auto"/>
+                    <w:rPr>
+                      <w:rFonts w:ascii="Inter Fallback" w:eastAsia="Times New Roman" w:hAnsi="Inter Fallback" w:cs="Times New Roman"/>
+                      <w:color w:val="373737"/>
+                      <w:kern w:val="0"/>
+                      <w:lang w:val="en-US"/>
+                      <w14:ligatures w14:val="none"/>
+                    </w:rPr>
+                  </w:pPr>
+                  <w:r>
+                    <w:rPr>
+                      <w:rFonts w:ascii="Inter Fallback" w:eastAsia="Times New Roman" w:hAnsi="Inter Fallback" w:cs="Times New Roman"/>
+                      <w:b/>
+                      <w:bCs/>
+                      <w:color w:val="373737"/>
+                      <w:kern w:val="0"/>
+                      <w:bdr w:val="single" w:sz="2" w:space="0" w:color="E5E7EB" w:frame="1"/>
+                      <w:lang w:val="en-US"/>
+                      <w14:ligatures w14:val="none"/>
+                    </w:rPr>
+                    <w:t>₹300-350/L</w:t>
+                  </w:r>
+                  <w:r>
+                    <w:rPr>
+                      <w:rFonts w:ascii="Inter Fallback" w:eastAsia="Times New Roman" w:hAnsi="Inter Fallback" w:cs="Times New Roman"/>
+                      <w:color w:val="373737"/>
+                      <w:kern w:val="0"/>
+                      <w:lang w:val="en-US"/>
+                      <w14:ligatures w14:val="none"/>
+                    </w:rPr>
+                    <w:t> </w:t>
+                  </w:r>
+                  <w:hyperlink r:id="rId9" w:tgtFrame="_blank" w:history="1">
+                    <w:r>
+                      <w:rPr>
+                        <w:rFonts w:ascii="Inter Fallback" w:eastAsia="Times New Roman" w:hAnsi="Inter Fallback" w:cs="Times New Roman"/>
+                        <w:color w:val="0000FF"/>
+                        <w:kern w:val="0"/>
+                        <w:bdr w:val="single" w:sz="2" w:space="0" w:color="E5E7EB" w:frame="1"/>
+                        <w:shd w:val="clear" w:color="auto" w:fill="F9F9F9"/>
+                        <w:lang w:val="en-US"/>
+                        <w14:ligatures w14:val="none"/>
+                      </w:rPr>
+                      <w:t>nobroker.in</w:t>
+                    </w:r>
+                  </w:hyperlink>
+                </w:p>
+              </w:tc>
+            </w:tr>
+            <w:tr>
+              <w:tc>
+                <w:tcPr>
+                  <w:tcW w:w="0" w:type="auto"/>
+                  <w:tcBorders>
+                    <w:top w:val="nil"/>
+                    <w:left w:val="nil"/>
+                    <w:bottom w:val="nil"/>
+                    <w:right w:val="nil"/>
+                  </w:tcBorders>
+                  <w:shd w:val="clear" w:color="auto" w:fill="FFFFFF"/>
+                  <w:vAlign w:val="center"/>
+                  <w:hideMark/>
+                </w:tcPr>
+                <w:p>
+                  <w:pPr>
+                    <w:spacing w:after="0" w:line="240" w:lineRule="auto"/>
+                    <w:rPr>
+                      <w:rFonts w:ascii="Inter Fallback" w:eastAsia="Times New Roman" w:hAnsi="Inter Fallback" w:cs="Times New Roman"/>
+                      <w:color w:val="373737"/>
+                      <w:kern w:val="0"/>
+                      <w:lang w:val="en-US"/>
+                      <w14:ligatures w14:val="none"/>
+                    </w:rPr>
+                  </w:pPr>
+                  <w:proofErr w:type="spellStart"/>
+                  <w:r>
+                    <w:rPr>
+                      <w:rFonts w:ascii="Inter Fallback" w:eastAsia="Times New Roman" w:hAnsi="Inter Fallback" w:cs="Times New Roman"/>
+                      <w:b/>
+                      <w:bCs/>
+                      <w:color w:val="373737"/>
+                      <w:kern w:val="0"/>
+                      <w:bdr w:val="single" w:sz="2" w:space="0" w:color="E5E7EB" w:frame="1"/>
+                      <w:lang w:val="en-US"/>
+                      <w14:ligatures w14:val="none"/>
+                    </w:rPr>
+                    <w:t>Nerolac</w:t>
+                  </w:r>
+                  <w:proofErr w:type="spellEnd"/>
+                  <w:r>
+                    <w:rPr>
+                      <w:rFonts w:ascii="Inter Fallback" w:eastAsia="Times New Roman" w:hAnsi="Inter Fallback" w:cs="Times New Roman"/>
+                      <w:b/>
+                      <w:bCs/>
+                      <w:color w:val="373737"/>
+                      <w:kern w:val="0"/>
+                      <w:bdr w:val="single" w:sz="2" w:space="0" w:color="E5E7EB" w:frame="1"/>
+                      <w:lang w:val="en-US"/>
+                      <w14:ligatures w14:val="none"/>
+                    </w:rPr>
+                    <w:t xml:space="preserve"> Impressions Eco Clean</w:t>
+                  </w:r>
+                </w:p>
+              </w:tc>
+              <w:tc>
+                <w:tcPr>
+                  <w:tcW w:w="0" w:type="auto"/>
+                  <w:tcBorders>
+                    <w:top w:val="nil"/>
+                    <w:left w:val="nil"/>
+                    <w:bottom w:val="nil"/>
+                    <w:right w:val="nil"/>
+                  </w:tcBorders>
+                  <w:shd w:val="clear" w:color="auto" w:fill="FFFFFF"/>
+                  <w:vAlign w:val="center"/>
+                  <w:hideMark/>
+                </w:tcPr>
+                <w:p>
+                  <w:pPr>
+                    <w:spacing w:after="0" w:line="240" w:lineRule="auto"/>
+                    <w:rPr>
+                      <w:rFonts w:ascii="Inter Fallback" w:eastAsia="Times New Roman" w:hAnsi="Inter Fallback" w:cs="Times New Roman"/>
+                      <w:color w:val="373737"/>
+                      <w:kern w:val="0"/>
+                      <w:lang w:val="en-US"/>
+                      <w14:ligatures w14:val="none"/>
+                    </w:rPr>
+                  </w:pPr>
+                  <w:r>
+                    <w:rPr>
+                      <w:rFonts w:ascii="Inter Fallback" w:eastAsia="Times New Roman" w:hAnsi="Inter Fallback" w:cs="Times New Roman"/>
+                      <w:color w:val="373737"/>
+                      <w:kern w:val="0"/>
+                      <w:lang w:val="en-US"/>
+                      <w14:ligatures w14:val="none"/>
+                    </w:rPr>
+                    <w:t>Premium emulsion</w:t>
+                  </w:r>
+                </w:p>
+              </w:tc>
+              <w:tc>
+                <w:tcPr>
+                  <w:tcW w:w="0" w:type="auto"/>
+                  <w:tcBorders>
+                    <w:top w:val="nil"/>
+                    <w:left w:val="nil"/>
+                    <w:bottom w:val="nil"/>
+                    <w:right w:val="nil"/>
+                  </w:tcBorders>
+                  <w:shd w:val="clear" w:color="auto" w:fill="FFFFFF"/>
+                  <w:vAlign w:val="center"/>
+                  <w:hideMark/>
+                </w:tcPr>
+                <w:p>
+                  <w:pPr>
+                    <w:spacing w:after="0" w:line="240" w:lineRule="auto"/>
+                    <w:rPr>
+                      <w:rFonts w:ascii="Inter Fallback" w:eastAsia="Times New Roman" w:hAnsi="Inter Fallback" w:cs="Times New Roman"/>
+                      <w:color w:val="373737"/>
+                      <w:kern w:val="0"/>
+                      <w:lang w:val="en-US"/>
+                      <w14:ligatures w14:val="none"/>
+                    </w:rPr>
+                  </w:pPr>
+                  <w:r>
+                    <w:rPr>
+                      <w:rFonts w:ascii="Inter Fallback" w:eastAsia="Times New Roman" w:hAnsi="Inter Fallback" w:cs="Times New Roman"/>
+                      <w:b/>
+                      <w:bCs/>
+                      <w:color w:val="373737"/>
+                      <w:kern w:val="0"/>
+                      <w:bdr w:val="single" w:sz="2" w:space="0" w:color="E5E7EB" w:frame="1"/>
+                      <w:lang w:val="en-US"/>
+                      <w14:ligatures w14:val="none"/>
+                    </w:rPr>
+                    <w:t>₹400-500/L</w:t>
+                  </w:r>
+                  <w:r>
+                    <w:rPr>
+                      <w:rFonts w:ascii="Inter Fallback" w:eastAsia="Times New Roman" w:hAnsi="Inter Fallback" w:cs="Times New Roman"/>
+                      <w:color w:val="373737"/>
+                      <w:kern w:val="0"/>
+                      <w:lang w:val="en-US"/>
+                      <w14:ligatures w14:val="none"/>
+                    </w:rPr>
+                    <w:t> </w:t>
+                  </w:r>
+                  <w:hyperlink r:id="rId10" w:tgtFrame="_blank" w:history="1">
+                    <w:r>
+                      <w:rPr>
+                        <w:rFonts w:ascii="Inter Fallback" w:eastAsia="Times New Roman" w:hAnsi="Inter Fallback" w:cs="Times New Roman"/>
+                        <w:color w:val="0000FF"/>
+                        <w:kern w:val="0"/>
+                        <w:bdr w:val="single" w:sz="2" w:space="0" w:color="E5E7EB" w:frame="1"/>
+                        <w:shd w:val="clear" w:color="auto" w:fill="F9F9F9"/>
+                        <w:lang w:val="en-US"/>
+                        <w14:ligatures w14:val="none"/>
+                      </w:rPr>
+                      <w:t>nobroker.in</w:t>
+                    </w:r>
+                  </w:hyperlink>
+                </w:p>
+              </w:tc>
+            </w:tr>
+          </w:tbl>
+          <w:p>
+            <w:pPr>
+              <w:pStyle w:val="NoSpacing"/>
+              <w:rPr>
+                <w:b/>
+                <w:bCs/>
+                <w:lang w:val="en-US"/>
+              </w:rPr>
+            </w:pPr>
+          </w:p>
+        </w:tc>
+      </w:tr>
+      <w:tr>
+        <w:tc>
+          <w:tcPr>
+            <w:tcW w:w="7576" w:type="dxa"/>
+          </w:tcPr>
+          <w:p>
+            <w:pPr>
+              <w:rPr>
+                <w:rFonts w:ascii="Inter Fallback" w:eastAsia="Times New Roman" w:hAnsi="Inter Fallback" w:cs="Times New Roman"/>
+                <w:b/>
+                <w:bCs/>
+                <w:color w:val="373737"/>
+                <w:kern w:val="0"/>
+                <w:bdr w:val="single" w:sz="2" w:space="0" w:color="E5E7EB" w:frame="1"/>
+                <w:lang w:val="en-US"/>
+                <w14:ligatures w14:val="none"/>
+              </w:rPr>
+            </w:pPr>
+          </w:p>
+          <w:p>
+            <w:pPr>
+              <w:rPr>
+                <w:rFonts w:ascii="Inter Fallback" w:eastAsia="Times New Roman" w:hAnsi="Inter Fallback" w:cs="Times New Roman"/>
+                <w:b/>
+                <w:bCs/>
+                <w:color w:val="373737"/>
+                <w:kern w:val="0"/>
+                <w:bdr w:val="single" w:sz="2" w:space="0" w:color="E5E7EB" w:frame="1"/>
+                <w:lang w:val="en-US"/>
+                <w14:ligatures w14:val="none"/>
+              </w:rPr>
+            </w:pPr>
+          </w:p>
+        </w:tc>
+      </w:tr>
+    </w:tbl>
+    <w:p>
+      <w:pPr>
+        <w:pStyle w:val="NoSpacing"/>
+        <w:ind w:left="1440"/>
+        <w:rPr>
+          <w:b/>
+          <w:bCs/>
+          <w:lang w:val="en-US"/>
+        </w:rPr>
+      </w:pPr>
+    </w:p>
+    <w:p>
+      <w:pPr>
+        <w:pStyle w:val="NoSpacing"/>
+        <w:ind w:left="1440"/>
+        <w:rPr>
+          <w:b/>
+          <w:bCs/>
+          <w:lang w:val="en-US"/>
+        </w:rPr>
+      </w:pPr>
+    </w:p>
+    <w:p>
+      <w:pPr>
+        <w:pStyle w:val="NoSpacing"/>
+        <w:ind w:left="1440"/>
+        <w:rPr>
+          <w:b/>
+          <w:bCs/>
+          <w:lang w:val="en-US"/>
+        </w:rPr>
+      </w:pPr>
+      <w:r>
+        <w:rPr>
+          <w:b/>
+          <w:bCs/>
+          <w:lang w:val="en-US"/>
+        </w:rPr>
+        <w:drawing>
+          <wp:inline distT="0" distB="0" distL="0" distR="0" wp14:anchorId="0AF3EAC1" wp14:editId="580EBAAB">
+            <wp:extent cx="5731510" cy="2541270"/>
+            <wp:effectExtent l="0" t="0" r="2540" b="0"/>
+            <wp:docPr id="601267448" name="Picture 1"/>
+            <wp:cNvGraphicFramePr>
+              <a:graphicFrameLocks xmlns:a="http://schemas.openxmlformats.org/drawingml/2006/main" noChangeAspect="1"/>
+            </wp:cNvGraphicFramePr>
+            <a:graphic xmlns:a="http://schemas.openxmlformats.org/drawingml/2006/main">
+              <a:graphicData uri="http://schemas.openxmlformats.org/drawingml/2006/picture">
+                <pic:pic xmlns:pic="http://schemas.openxmlformats.org/drawingml/2006/picture">
+                  <pic:nvPicPr>
+                    <pic:cNvPr id="601267448" name=""/>
+                    <pic:cNvPicPr/>
+                  </pic:nvPicPr>
+                  <pic:blipFill>
+                    <a:blip r:embed="rId11"/>
+                    <a:stretch>
+                      <a:fillRect/>
+                    </a:stretch>
+                  </pic:blipFill>
+                  <pic:spPr>
+                    <a:xfrm>
+                      <a:off x="0" y="0"/>
+                      <a:ext cx="5731510" cy="2541270"/>
+                    </a:xfrm>
+                    <a:prstGeom prst="rect">
+                      <a:avLst/>
+                    </a:prstGeom>
+                  </pic:spPr>
+                </pic:pic>
+              </a:graphicData>
+            </a:graphic>
+          </wp:inline>
+        </w:drawing>
+      </w:r>
+    </w:p>
+    <w:p>
+      <w:pPr>
+        <w:pStyle w:val="NoSpacing"/>
+        <w:ind w:left="1440"/>
+        <w:rPr>
+          <w:b/>
+          <w:bCs/>
+          <w:lang w:val="en-US"/>
+        </w:rPr>
+      </w:pPr>
+    </w:p>
+    <w:p>
+      <w:pPr>
+        <w:pStyle w:val="NoSpacing"/>
+        <w:ind w:left="1440"/>
+        <w:rPr>
+          <w:b/>
+          <w:bCs/>
+          <w:lang w:val="en-US"/>
+        </w:rPr>
+      </w:pPr>
+      <w:r>
+        <w:rPr>
+          <w:b/>
+          <w:bCs/>
+          <w:lang w:val="en-US"/>
+        </w:rPr>
+        <w:t>I want the UI like</w:t>
+      </w:r>
+    </w:p>
+    <w:p>
+      <w:pPr>
+        <w:pStyle w:val="NoSpacing"/>
+        <w:ind w:left="1440"/>
+        <w:rPr>
+          <w:b/>
+          <w:bCs/>
+          <w:lang w:val="en-US"/>
+        </w:rPr>
+      </w:pPr>
+      <w:r>
+        <w:rPr>
+          <w:b/>
+          <w:bCs/>
+          <w:lang w:val="en-US"/>
+        </w:rPr>
+        <w:t>Header</w:t>
+      </w:r>
+    </w:p>
+    <w:p>
+      <w:pPr>
+        <w:pStyle w:val="NoSpacing"/>
+        <w:ind w:left="1440"/>
+        <w:rPr>
+          <w:b/>
+          <w:bCs/>
+          <w:lang w:val="en-US"/>
+        </w:rPr>
+      </w:pPr>
+      <w:r>
+        <w:rPr>
+          <w:b/>
+          <w:bCs/>
+          <w:lang w:val="en-US"/>
+        </w:rPr>
+        <w:t>Sidebar collapse and expand</w:t>
+      </w:r>
+    </w:p>
+    <w:p>
+      <w:pPr>
+        <w:pStyle w:val="NoSpacing"/>
+        <w:ind w:left="1440"/>
+        <w:rPr>
+          <w:b/>
+          <w:bCs/>
+          <w:lang w:val="en-US"/>
+        </w:rPr>
+      </w:pPr>
+      <w:r>
+        <w:rPr>
+          <w:b/>
+          <w:bCs/>
+          <w:lang w:val="en-US"/>
+        </w:rPr>
+        <w:t>Content area background color</w:t>
+      </w:r>
+    </w:p>
+    <w:p>
+      <w:pPr>
+        <w:pStyle w:val="NoSpacing"/>
+        <w:ind w:left="1440"/>
+        <w:rPr>
+          <w:b/>
+          <w:bCs/>
+          <w:lang w:val="en-US"/>
+        </w:rPr>
+      </w:pPr>
+      <w:r>
+        <w:rPr>
+          <w:b/>
+          <w:bCs/>
+          <w:lang w:val="en-US"/>
+        </w:rPr>
+        <w:t>Font size should be little small than this</w:t>
+      </w:r>
+    </w:p>
+    <w:p>
+      <w:pPr>
+        <w:pStyle w:val="NoSpacing"/>
+        <w:ind w:left="1440"/>
+        <w:rPr>
+          <w:b/>
+          <w:bCs/>
+          <w:lang w:val="en-US"/>
+        </w:rPr>
+      </w:pPr>
+      <w:r>
+        <w:rPr>
+          <w:b/>
+          <w:bCs/>
+          <w:lang w:val="en-US"/>
+        </w:rPr>
+        <w:t>In Sidebar when expand one other should collapse</w:t>
+      </w:r>
+    </w:p>
+    <w:p>
+      <w:pPr>
+        <w:pStyle w:val="NoSpacing"/>
+        <w:ind w:left="1440"/>
+        <w:rPr>
+          <w:b/>
+          <w:bCs/>
+          <w:lang w:val="en-US"/>
+        </w:rPr>
+      </w:pPr>
+      <w:r>
+        <w:rPr>
+          <w:b/>
+          <w:bCs/>
+          <w:lang w:val="en-US"/>
+        </w:rPr>
+        <w:t xml:space="preserve">Color theme </w:t>
+      </w:r>
+      <w:proofErr w:type="gramStart"/>
+      <w:r>
+        <w:rPr>
+          <w:b/>
+          <w:bCs/>
+          <w:lang w:val="en-US"/>
+        </w:rPr>
+        <w:t>follow</w:t>
+      </w:r>
+      <w:proofErr w:type="gramEnd"/>
+      <w:r>
+        <w:rPr>
+          <w:b/>
+          <w:bCs/>
+          <w:lang w:val="en-US"/>
+        </w:rPr>
+        <w:t xml:space="preserve"> like this image</w:t>
+      </w:r>
     </w:p>
     <w:sectPr>
       <w:pgSz w:w="11906" w:h="16838"/>
@@ -4779,6 +7582,155 @@
     </w:lvl>
   </w:abstractNum>
   <w:abstractNum w:abstractNumId="10" w15:restartNumberingAfterBreak="0">
+    <w:nsid w:val="30F60000"/>
+    <w:multiLevelType w:val="multilevel"/>
+    <w:tmpl w:val="4F528642"/>
+    <w:lvl w:ilvl="0">
+      <w:start w:val="1"/>
+      <w:numFmt w:val="bullet"/>
+      <w:lvlText w:val=""/>
+      <w:lvlJc w:val="left"/>
+      <w:pPr>
+        <w:tabs>
+          <w:tab w:val="num" w:pos="720"/>
+        </w:tabs>
+        <w:ind w:left="720" w:hanging="360"/>
+      </w:pPr>
+      <w:rPr>
+        <w:rFonts w:ascii="Symbol" w:hAnsi="Symbol" w:hint="default"/>
+        <w:sz w:val="20"/>
+      </w:rPr>
+    </w:lvl>
+    <w:lvl w:ilvl="1" w:tentative="1">
+      <w:start w:val="1"/>
+      <w:numFmt w:val="bullet"/>
+      <w:lvlText w:val="o"/>
+      <w:lvlJc w:val="left"/>
+      <w:pPr>
+        <w:tabs>
+          <w:tab w:val="num" w:pos="1440"/>
+        </w:tabs>
+        <w:ind w:left="1440" w:hanging="360"/>
+      </w:pPr>
+      <w:rPr>
+        <w:rFonts w:ascii="Courier New" w:hAnsi="Courier New" w:hint="default"/>
+        <w:sz w:val="20"/>
+      </w:rPr>
+    </w:lvl>
+    <w:lvl w:ilvl="2" w:tentative="1">
+      <w:start w:val="1"/>
+      <w:numFmt w:val="bullet"/>
+      <w:lvlText w:val=""/>
+      <w:lvlJc w:val="left"/>
+      <w:pPr>
+        <w:tabs>
+          <w:tab w:val="num" w:pos="2160"/>
+        </w:tabs>
+        <w:ind w:left="2160" w:hanging="360"/>
+      </w:pPr>
+      <w:rPr>
+        <w:rFonts w:ascii="Wingdings" w:hAnsi="Wingdings" w:hint="default"/>
+        <w:sz w:val="20"/>
+      </w:rPr>
+    </w:lvl>
+    <w:lvl w:ilvl="3" w:tentative="1">
+      <w:start w:val="1"/>
+      <w:numFmt w:val="bullet"/>
+      <w:lvlText w:val=""/>
+      <w:lvlJc w:val="left"/>
+      <w:pPr>
+        <w:tabs>
+          <w:tab w:val="num" w:pos="2880"/>
+        </w:tabs>
+        <w:ind w:left="2880" w:hanging="360"/>
+      </w:pPr>
+      <w:rPr>
+        <w:rFonts w:ascii="Wingdings" w:hAnsi="Wingdings" w:hint="default"/>
+        <w:sz w:val="20"/>
+      </w:rPr>
+    </w:lvl>
+    <w:lvl w:ilvl="4" w:tentative="1">
+      <w:start w:val="1"/>
+      <w:numFmt w:val="bullet"/>
+      <w:lvlText w:val=""/>
+      <w:lvlJc w:val="left"/>
+      <w:pPr>
+        <w:tabs>
+          <w:tab w:val="num" w:pos="3600"/>
+        </w:tabs>
+        <w:ind w:left="3600" w:hanging="360"/>
+      </w:pPr>
+      <w:rPr>
+        <w:rFonts w:ascii="Wingdings" w:hAnsi="Wingdings" w:hint="default"/>
+        <w:sz w:val="20"/>
+      </w:rPr>
+    </w:lvl>
+    <w:lvl w:ilvl="5" w:tentative="1">
+      <w:start w:val="1"/>
+      <w:numFmt w:val="bullet"/>
+      <w:lvlText w:val=""/>
+      <w:lvlJc w:val="left"/>
+      <w:pPr>
+        <w:tabs>
+          <w:tab w:val="num" w:pos="4320"/>
+        </w:tabs>
+        <w:ind w:left="4320" w:hanging="360"/>
+      </w:pPr>
+      <w:rPr>
+        <w:rFonts w:ascii="Wingdings" w:hAnsi="Wingdings" w:hint="default"/>
+        <w:sz w:val="20"/>
+      </w:rPr>
+    </w:lvl>
+    <w:lvl w:ilvl="6" w:tentative="1">
+      <w:start w:val="1"/>
+      <w:numFmt w:val="bullet"/>
+      <w:lvlText w:val=""/>
+      <w:lvlJc w:val="left"/>
+      <w:pPr>
+        <w:tabs>
+          <w:tab w:val="num" w:pos="5040"/>
+        </w:tabs>
+        <w:ind w:left="5040" w:hanging="360"/>
+      </w:pPr>
+      <w:rPr>
+        <w:rFonts w:ascii="Wingdings" w:hAnsi="Wingdings" w:hint="default"/>
+        <w:sz w:val="20"/>
+      </w:rPr>
+    </w:lvl>
+    <w:lvl w:ilvl="7" w:tentative="1">
+      <w:start w:val="1"/>
+      <w:numFmt w:val="bullet"/>
+      <w:lvlText w:val=""/>
+      <w:lvlJc w:val="left"/>
+      <w:pPr>
+        <w:tabs>
+          <w:tab w:val="num" w:pos="5760"/>
+        </w:tabs>
+        <w:ind w:left="5760" w:hanging="360"/>
+      </w:pPr>
+      <w:rPr>
+        <w:rFonts w:ascii="Wingdings" w:hAnsi="Wingdings" w:hint="default"/>
+        <w:sz w:val="20"/>
+      </w:rPr>
+    </w:lvl>
+    <w:lvl w:ilvl="8" w:tentative="1">
+      <w:start w:val="1"/>
+      <w:numFmt w:val="bullet"/>
+      <w:lvlText w:val=""/>
+      <w:lvlJc w:val="left"/>
+      <w:pPr>
+        <w:tabs>
+          <w:tab w:val="num" w:pos="6480"/>
+        </w:tabs>
+        <w:ind w:left="6480" w:hanging="360"/>
+      </w:pPr>
+      <w:rPr>
+        <w:rFonts w:ascii="Wingdings" w:hAnsi="Wingdings" w:hint="default"/>
+        <w:sz w:val="20"/>
+      </w:rPr>
+    </w:lvl>
+  </w:abstractNum>
+  <w:abstractNum w:abstractNumId="11" w15:restartNumberingAfterBreak="0">
     <w:nsid w:val="341551EF"/>
     <w:multiLevelType w:val="hybridMultilevel"/>
     <w:tmpl w:val="AA002C78"/>
@@ -4867,7 +7819,156 @@
       </w:pPr>
     </w:lvl>
   </w:abstractNum>
-  <w:abstractNum w:abstractNumId="11" w15:restartNumberingAfterBreak="0">
+  <w:abstractNum w:abstractNumId="12" w15:restartNumberingAfterBreak="0">
+    <w:nsid w:val="3A841482"/>
+    <w:multiLevelType w:val="multilevel"/>
+    <w:tmpl w:val="04FEBC60"/>
+    <w:lvl w:ilvl="0">
+      <w:start w:val="1"/>
+      <w:numFmt w:val="bullet"/>
+      <w:lvlText w:val=""/>
+      <w:lvlJc w:val="left"/>
+      <w:pPr>
+        <w:tabs>
+          <w:tab w:val="num" w:pos="720"/>
+        </w:tabs>
+        <w:ind w:left="720" w:hanging="360"/>
+      </w:pPr>
+      <w:rPr>
+        <w:rFonts w:ascii="Symbol" w:hAnsi="Symbol" w:hint="default"/>
+        <w:sz w:val="20"/>
+      </w:rPr>
+    </w:lvl>
+    <w:lvl w:ilvl="1" w:tentative="1">
+      <w:start w:val="1"/>
+      <w:numFmt w:val="bullet"/>
+      <w:lvlText w:val="o"/>
+      <w:lvlJc w:val="left"/>
+      <w:pPr>
+        <w:tabs>
+          <w:tab w:val="num" w:pos="1440"/>
+        </w:tabs>
+        <w:ind w:left="1440" w:hanging="360"/>
+      </w:pPr>
+      <w:rPr>
+        <w:rFonts w:ascii="Courier New" w:hAnsi="Courier New" w:hint="default"/>
+        <w:sz w:val="20"/>
+      </w:rPr>
+    </w:lvl>
+    <w:lvl w:ilvl="2" w:tentative="1">
+      <w:start w:val="1"/>
+      <w:numFmt w:val="bullet"/>
+      <w:lvlText w:val=""/>
+      <w:lvlJc w:val="left"/>
+      <w:pPr>
+        <w:tabs>
+          <w:tab w:val="num" w:pos="2160"/>
+        </w:tabs>
+        <w:ind w:left="2160" w:hanging="360"/>
+      </w:pPr>
+      <w:rPr>
+        <w:rFonts w:ascii="Wingdings" w:hAnsi="Wingdings" w:hint="default"/>
+        <w:sz w:val="20"/>
+      </w:rPr>
+    </w:lvl>
+    <w:lvl w:ilvl="3" w:tentative="1">
+      <w:start w:val="1"/>
+      <w:numFmt w:val="bullet"/>
+      <w:lvlText w:val=""/>
+      <w:lvlJc w:val="left"/>
+      <w:pPr>
+        <w:tabs>
+          <w:tab w:val="num" w:pos="2880"/>
+        </w:tabs>
+        <w:ind w:left="2880" w:hanging="360"/>
+      </w:pPr>
+      <w:rPr>
+        <w:rFonts w:ascii="Wingdings" w:hAnsi="Wingdings" w:hint="default"/>
+        <w:sz w:val="20"/>
+      </w:rPr>
+    </w:lvl>
+    <w:lvl w:ilvl="4" w:tentative="1">
+      <w:start w:val="1"/>
+      <w:numFmt w:val="bullet"/>
+      <w:lvlText w:val=""/>
+      <w:lvlJc w:val="left"/>
+      <w:pPr>
+        <w:tabs>
+          <w:tab w:val="num" w:pos="3600"/>
+        </w:tabs>
+        <w:ind w:left="3600" w:hanging="360"/>
+      </w:pPr>
+      <w:rPr>
+        <w:rFonts w:ascii="Wingdings" w:hAnsi="Wingdings" w:hint="default"/>
+        <w:sz w:val="20"/>
+      </w:rPr>
+    </w:lvl>
+    <w:lvl w:ilvl="5" w:tentative="1">
+      <w:start w:val="1"/>
+      <w:numFmt w:val="bullet"/>
+      <w:lvlText w:val=""/>
+      <w:lvlJc w:val="left"/>
+      <w:pPr>
+        <w:tabs>
+          <w:tab w:val="num" w:pos="4320"/>
+        </w:tabs>
+        <w:ind w:left="4320" w:hanging="360"/>
+      </w:pPr>
+      <w:rPr>
+        <w:rFonts w:ascii="Wingdings" w:hAnsi="Wingdings" w:hint="default"/>
+        <w:sz w:val="20"/>
+      </w:rPr>
+    </w:lvl>
+    <w:lvl w:ilvl="6" w:tentative="1">
+      <w:start w:val="1"/>
+      <w:numFmt w:val="bullet"/>
+      <w:lvlText w:val=""/>
+      <w:lvlJc w:val="left"/>
+      <w:pPr>
+        <w:tabs>
+          <w:tab w:val="num" w:pos="5040"/>
+        </w:tabs>
+        <w:ind w:left="5040" w:hanging="360"/>
+      </w:pPr>
+      <w:rPr>
+        <w:rFonts w:ascii="Wingdings" w:hAnsi="Wingdings" w:hint="default"/>
+        <w:sz w:val="20"/>
+      </w:rPr>
+    </w:lvl>
+    <w:lvl w:ilvl="7" w:tentative="1">
+      <w:start w:val="1"/>
+      <w:numFmt w:val="bullet"/>
+      <w:lvlText w:val=""/>
+      <w:lvlJc w:val="left"/>
+      <w:pPr>
+        <w:tabs>
+          <w:tab w:val="num" w:pos="5760"/>
+        </w:tabs>
+        <w:ind w:left="5760" w:hanging="360"/>
+      </w:pPr>
+      <w:rPr>
+        <w:rFonts w:ascii="Wingdings" w:hAnsi="Wingdings" w:hint="default"/>
+        <w:sz w:val="20"/>
+      </w:rPr>
+    </w:lvl>
+    <w:lvl w:ilvl="8" w:tentative="1">
+      <w:start w:val="1"/>
+      <w:numFmt w:val="bullet"/>
+      <w:lvlText w:val=""/>
+      <w:lvlJc w:val="left"/>
+      <w:pPr>
+        <w:tabs>
+          <w:tab w:val="num" w:pos="6480"/>
+        </w:tabs>
+        <w:ind w:left="6480" w:hanging="360"/>
+      </w:pPr>
+      <w:rPr>
+        <w:rFonts w:ascii="Wingdings" w:hAnsi="Wingdings" w:hint="default"/>
+        <w:sz w:val="20"/>
+      </w:rPr>
+    </w:lvl>
+  </w:abstractNum>
+  <w:abstractNum w:abstractNumId="13" w15:restartNumberingAfterBreak="0">
     <w:nsid w:val="3C025123"/>
     <w:multiLevelType w:val="hybridMultilevel"/>
     <w:tmpl w:val="ED72C358"/>
@@ -4956,7 +8057,156 @@
       </w:pPr>
     </w:lvl>
   </w:abstractNum>
-  <w:abstractNum w:abstractNumId="12" w15:restartNumberingAfterBreak="0">
+  <w:abstractNum w:abstractNumId="14" w15:restartNumberingAfterBreak="0">
+    <w:nsid w:val="3EE64ECE"/>
+    <w:multiLevelType w:val="multilevel"/>
+    <w:tmpl w:val="E7042036"/>
+    <w:lvl w:ilvl="0">
+      <w:start w:val="1"/>
+      <w:numFmt w:val="bullet"/>
+      <w:lvlText w:val=""/>
+      <w:lvlJc w:val="left"/>
+      <w:pPr>
+        <w:tabs>
+          <w:tab w:val="num" w:pos="720"/>
+        </w:tabs>
+        <w:ind w:left="720" w:hanging="360"/>
+      </w:pPr>
+      <w:rPr>
+        <w:rFonts w:ascii="Symbol" w:hAnsi="Symbol" w:hint="default"/>
+        <w:sz w:val="20"/>
+      </w:rPr>
+    </w:lvl>
+    <w:lvl w:ilvl="1" w:tentative="1">
+      <w:start w:val="1"/>
+      <w:numFmt w:val="bullet"/>
+      <w:lvlText w:val="o"/>
+      <w:lvlJc w:val="left"/>
+      <w:pPr>
+        <w:tabs>
+          <w:tab w:val="num" w:pos="1440"/>
+        </w:tabs>
+        <w:ind w:left="1440" w:hanging="360"/>
+      </w:pPr>
+      <w:rPr>
+        <w:rFonts w:ascii="Courier New" w:hAnsi="Courier New" w:hint="default"/>
+        <w:sz w:val="20"/>
+      </w:rPr>
+    </w:lvl>
+    <w:lvl w:ilvl="2" w:tentative="1">
+      <w:start w:val="1"/>
+      <w:numFmt w:val="bullet"/>
+      <w:lvlText w:val=""/>
+      <w:lvlJc w:val="left"/>
+      <w:pPr>
+        <w:tabs>
+          <w:tab w:val="num" w:pos="2160"/>
+        </w:tabs>
+        <w:ind w:left="2160" w:hanging="360"/>
+      </w:pPr>
+      <w:rPr>
+        <w:rFonts w:ascii="Wingdings" w:hAnsi="Wingdings" w:hint="default"/>
+        <w:sz w:val="20"/>
+      </w:rPr>
+    </w:lvl>
+    <w:lvl w:ilvl="3" w:tentative="1">
+      <w:start w:val="1"/>
+      <w:numFmt w:val="bullet"/>
+      <w:lvlText w:val=""/>
+      <w:lvlJc w:val="left"/>
+      <w:pPr>
+        <w:tabs>
+          <w:tab w:val="num" w:pos="2880"/>
+        </w:tabs>
+        <w:ind w:left="2880" w:hanging="360"/>
+      </w:pPr>
+      <w:rPr>
+        <w:rFonts w:ascii="Wingdings" w:hAnsi="Wingdings" w:hint="default"/>
+        <w:sz w:val="20"/>
+      </w:rPr>
+    </w:lvl>
+    <w:lvl w:ilvl="4" w:tentative="1">
+      <w:start w:val="1"/>
+      <w:numFmt w:val="bullet"/>
+      <w:lvlText w:val=""/>
+      <w:lvlJc w:val="left"/>
+      <w:pPr>
+        <w:tabs>
+          <w:tab w:val="num" w:pos="3600"/>
+        </w:tabs>
+        <w:ind w:left="3600" w:hanging="360"/>
+      </w:pPr>
+      <w:rPr>
+        <w:rFonts w:ascii="Wingdings" w:hAnsi="Wingdings" w:hint="default"/>
+        <w:sz w:val="20"/>
+      </w:rPr>
+    </w:lvl>
+    <w:lvl w:ilvl="5" w:tentative="1">
+      <w:start w:val="1"/>
+      <w:numFmt w:val="bullet"/>
+      <w:lvlText w:val=""/>
+      <w:lvlJc w:val="left"/>
+      <w:pPr>
+        <w:tabs>
+          <w:tab w:val="num" w:pos="4320"/>
+        </w:tabs>
+        <w:ind w:left="4320" w:hanging="360"/>
+      </w:pPr>
+      <w:rPr>
+        <w:rFonts w:ascii="Wingdings" w:hAnsi="Wingdings" w:hint="default"/>
+        <w:sz w:val="20"/>
+      </w:rPr>
+    </w:lvl>
+    <w:lvl w:ilvl="6" w:tentative="1">
+      <w:start w:val="1"/>
+      <w:numFmt w:val="bullet"/>
+      <w:lvlText w:val=""/>
+      <w:lvlJc w:val="left"/>
+      <w:pPr>
+        <w:tabs>
+          <w:tab w:val="num" w:pos="5040"/>
+        </w:tabs>
+        <w:ind w:left="5040" w:hanging="360"/>
+      </w:pPr>
+      <w:rPr>
+        <w:rFonts w:ascii="Wingdings" w:hAnsi="Wingdings" w:hint="default"/>
+        <w:sz w:val="20"/>
+      </w:rPr>
+    </w:lvl>
+    <w:lvl w:ilvl="7" w:tentative="1">
+      <w:start w:val="1"/>
+      <w:numFmt w:val="bullet"/>
+      <w:lvlText w:val=""/>
+      <w:lvlJc w:val="left"/>
+      <w:pPr>
+        <w:tabs>
+          <w:tab w:val="num" w:pos="5760"/>
+        </w:tabs>
+        <w:ind w:left="5760" w:hanging="360"/>
+      </w:pPr>
+      <w:rPr>
+        <w:rFonts w:ascii="Wingdings" w:hAnsi="Wingdings" w:hint="default"/>
+        <w:sz w:val="20"/>
+      </w:rPr>
+    </w:lvl>
+    <w:lvl w:ilvl="8" w:tentative="1">
+      <w:start w:val="1"/>
+      <w:numFmt w:val="bullet"/>
+      <w:lvlText w:val=""/>
+      <w:lvlJc w:val="left"/>
+      <w:pPr>
+        <w:tabs>
+          <w:tab w:val="num" w:pos="6480"/>
+        </w:tabs>
+        <w:ind w:left="6480" w:hanging="360"/>
+      </w:pPr>
+      <w:rPr>
+        <w:rFonts w:ascii="Wingdings" w:hAnsi="Wingdings" w:hint="default"/>
+        <w:sz w:val="20"/>
+      </w:rPr>
+    </w:lvl>
+  </w:abstractNum>
+  <w:abstractNum w:abstractNumId="15" w15:restartNumberingAfterBreak="0">
     <w:nsid w:val="3F7C388B"/>
     <w:multiLevelType w:val="multilevel"/>
     <w:tmpl w:val="F244DFEE"/>
@@ -5105,7 +8355,273 @@
       </w:rPr>
     </w:lvl>
   </w:abstractNum>
-  <w:abstractNum w:abstractNumId="13" w15:restartNumberingAfterBreak="0">
+  <w:abstractNum w:abstractNumId="16" w15:restartNumberingAfterBreak="0">
+    <w:nsid w:val="41E41A0F"/>
+    <w:multiLevelType w:val="multilevel"/>
+    <w:tmpl w:val="E8CEC8EC"/>
+    <w:lvl w:ilvl="0">
+      <w:start w:val="1"/>
+      <w:numFmt w:val="bullet"/>
+      <w:lvlText w:val=""/>
+      <w:lvlJc w:val="left"/>
+      <w:pPr>
+        <w:tabs>
+          <w:tab w:val="num" w:pos="720"/>
+        </w:tabs>
+        <w:ind w:left="720" w:hanging="360"/>
+      </w:pPr>
+      <w:rPr>
+        <w:rFonts w:ascii="Symbol" w:hAnsi="Symbol" w:hint="default"/>
+        <w:sz w:val="20"/>
+      </w:rPr>
+    </w:lvl>
+    <w:lvl w:ilvl="1" w:tentative="1">
+      <w:start w:val="1"/>
+      <w:numFmt w:val="bullet"/>
+      <w:lvlText w:val="o"/>
+      <w:lvlJc w:val="left"/>
+      <w:pPr>
+        <w:tabs>
+          <w:tab w:val="num" w:pos="1440"/>
+        </w:tabs>
+        <w:ind w:left="1440" w:hanging="360"/>
+      </w:pPr>
+      <w:rPr>
+        <w:rFonts w:ascii="Courier New" w:hAnsi="Courier New" w:hint="default"/>
+        <w:sz w:val="20"/>
+      </w:rPr>
+    </w:lvl>
+    <w:lvl w:ilvl="2" w:tentative="1">
+      <w:start w:val="1"/>
+      <w:numFmt w:val="bullet"/>
+      <w:lvlText w:val=""/>
+      <w:lvlJc w:val="left"/>
+      <w:pPr>
+        <w:tabs>
+          <w:tab w:val="num" w:pos="2160"/>
+        </w:tabs>
+        <w:ind w:left="2160" w:hanging="360"/>
+      </w:pPr>
+      <w:rPr>
+        <w:rFonts w:ascii="Wingdings" w:hAnsi="Wingdings" w:hint="default"/>
+        <w:sz w:val="20"/>
+      </w:rPr>
+    </w:lvl>
+    <w:lvl w:ilvl="3" w:tentative="1">
+      <w:start w:val="1"/>
+      <w:numFmt w:val="bullet"/>
+      <w:lvlText w:val=""/>
+      <w:lvlJc w:val="left"/>
+      <w:pPr>
+        <w:tabs>
+          <w:tab w:val="num" w:pos="2880"/>
+        </w:tabs>
+        <w:ind w:left="2880" w:hanging="360"/>
+      </w:pPr>
+      <w:rPr>
+        <w:rFonts w:ascii="Wingdings" w:hAnsi="Wingdings" w:hint="default"/>
+        <w:sz w:val="20"/>
+      </w:rPr>
+    </w:lvl>
+    <w:lvl w:ilvl="4" w:tentative="1">
+      <w:start w:val="1"/>
+      <w:numFmt w:val="bullet"/>
+      <w:lvlText w:val=""/>
+      <w:lvlJc w:val="left"/>
+      <w:pPr>
+        <w:tabs>
+          <w:tab w:val="num" w:pos="3600"/>
+        </w:tabs>
+        <w:ind w:left="3600" w:hanging="360"/>
+      </w:pPr>
+      <w:rPr>
+        <w:rFonts w:ascii="Wingdings" w:hAnsi="Wingdings" w:hint="default"/>
+        <w:sz w:val="20"/>
+      </w:rPr>
+    </w:lvl>
+    <w:lvl w:ilvl="5" w:tentative="1">
+      <w:start w:val="1"/>
+      <w:numFmt w:val="bullet"/>
+      <w:lvlText w:val=""/>
+      <w:lvlJc w:val="left"/>
+      <w:pPr>
+        <w:tabs>
+          <w:tab w:val="num" w:pos="4320"/>
+        </w:tabs>
+        <w:ind w:left="4320" w:hanging="360"/>
+      </w:pPr>
+      <w:rPr>
+        <w:rFonts w:ascii="Wingdings" w:hAnsi="Wingdings" w:hint="default"/>
+        <w:sz w:val="20"/>
+      </w:rPr>
+    </w:lvl>
+    <w:lvl w:ilvl="6" w:tentative="1">
+      <w:start w:val="1"/>
+      <w:numFmt w:val="bullet"/>
+      <w:lvlText w:val=""/>
+      <w:lvlJc w:val="left"/>
+      <w:pPr>
+        <w:tabs>
+          <w:tab w:val="num" w:pos="5040"/>
+        </w:tabs>
+        <w:ind w:left="5040" w:hanging="360"/>
+      </w:pPr>
+      <w:rPr>
+        <w:rFonts w:ascii="Wingdings" w:hAnsi="Wingdings" w:hint="default"/>
+        <w:sz w:val="20"/>
+      </w:rPr>
+    </w:lvl>
+    <w:lvl w:ilvl="7" w:tentative="1">
+      <w:start w:val="1"/>
+      <w:numFmt w:val="bullet"/>
+      <w:lvlText w:val=""/>
+      <w:lvlJc w:val="left"/>
+      <w:pPr>
+        <w:tabs>
+          <w:tab w:val="num" w:pos="5760"/>
+        </w:tabs>
+        <w:ind w:left="5760" w:hanging="360"/>
+      </w:pPr>
+      <w:rPr>
+        <w:rFonts w:ascii="Wingdings" w:hAnsi="Wingdings" w:hint="default"/>
+        <w:sz w:val="20"/>
+      </w:rPr>
+    </w:lvl>
+    <w:lvl w:ilvl="8" w:tentative="1">
+      <w:start w:val="1"/>
+      <w:numFmt w:val="bullet"/>
+      <w:lvlText w:val=""/>
+      <w:lvlJc w:val="left"/>
+      <w:pPr>
+        <w:tabs>
+          <w:tab w:val="num" w:pos="6480"/>
+        </w:tabs>
+        <w:ind w:left="6480" w:hanging="360"/>
+      </w:pPr>
+      <w:rPr>
+        <w:rFonts w:ascii="Wingdings" w:hAnsi="Wingdings" w:hint="default"/>
+        <w:sz w:val="20"/>
+      </w:rPr>
+    </w:lvl>
+  </w:abstractNum>
+  <w:abstractNum w:abstractNumId="17" w15:restartNumberingAfterBreak="0">
+    <w:nsid w:val="47541A51"/>
+    <w:multiLevelType w:val="multilevel"/>
+    <w:tmpl w:val="B1769196"/>
+    <w:lvl w:ilvl="0">
+      <w:start w:val="1"/>
+      <w:numFmt w:val="decimal"/>
+      <w:lvlText w:val="%1."/>
+      <w:lvlJc w:val="left"/>
+      <w:pPr>
+        <w:tabs>
+          <w:tab w:val="num" w:pos="720"/>
+        </w:tabs>
+        <w:ind w:left="720" w:hanging="360"/>
+      </w:pPr>
+    </w:lvl>
+    <w:lvl w:ilvl="1">
+      <w:start w:val="1"/>
+      <w:numFmt w:val="bullet"/>
+      <w:lvlText w:val="o"/>
+      <w:lvlJc w:val="left"/>
+      <w:pPr>
+        <w:tabs>
+          <w:tab w:val="num" w:pos="1440"/>
+        </w:tabs>
+        <w:ind w:left="1440" w:hanging="360"/>
+      </w:pPr>
+      <w:rPr>
+        <w:rFonts w:ascii="Courier New" w:hAnsi="Courier New" w:hint="default"/>
+        <w:sz w:val="20"/>
+      </w:rPr>
+    </w:lvl>
+    <w:lvl w:ilvl="2" w:tentative="1">
+      <w:start w:val="1"/>
+      <w:numFmt w:val="decimal"/>
+      <w:lvlText w:val="%3."/>
+      <w:lvlJc w:val="left"/>
+      <w:pPr>
+        <w:tabs>
+          <w:tab w:val="num" w:pos="2160"/>
+        </w:tabs>
+        <w:ind w:left="2160" w:hanging="360"/>
+      </w:pPr>
+    </w:lvl>
+    <w:lvl w:ilvl="3" w:tentative="1">
+      <w:start w:val="1"/>
+      <w:numFmt w:val="decimal"/>
+      <w:lvlText w:val="%4."/>
+      <w:lvlJc w:val="left"/>
+      <w:pPr>
+        <w:tabs>
+          <w:tab w:val="num" w:pos="2880"/>
+        </w:tabs>
+        <w:ind w:left="2880" w:hanging="360"/>
+      </w:pPr>
+    </w:lvl>
+    <w:lvl w:ilvl="4" w:tentative="1">
+      <w:start w:val="1"/>
+      <w:numFmt w:val="decimal"/>
+      <w:lvlText w:val="%5."/>
+      <w:lvlJc w:val="left"/>
+      <w:pPr>
+        <w:tabs>
+          <w:tab w:val="num" w:pos="3600"/>
+        </w:tabs>
+        <w:ind w:left="3600" w:hanging="360"/>
+      </w:pPr>
+    </w:lvl>
+    <w:lvl w:ilvl="5" w:tentative="1">
+      <w:start w:val="1"/>
+      <w:numFmt w:val="decimal"/>
+      <w:lvlText w:val="%6."/>
+      <w:lvlJc w:val="left"/>
+      <w:pPr>
+        <w:tabs>
+          <w:tab w:val="num" w:pos="4320"/>
+        </w:tabs>
+        <w:ind w:left="4320" w:hanging="360"/>
+      </w:pPr>
+    </w:lvl>
+    <w:lvl w:ilvl="6" w:tentative="1">
+      <w:start w:val="1"/>
+      <w:numFmt w:val="decimal"/>
+      <w:lvlText w:val="%7."/>
+      <w:lvlJc w:val="left"/>
+      <w:pPr>
+        <w:tabs>
+          <w:tab w:val="num" w:pos="5040"/>
+        </w:tabs>
+        <w:ind w:left="5040" w:hanging="360"/>
+      </w:pPr>
+    </w:lvl>
+    <w:lvl w:ilvl="7" w:tentative="1">
+      <w:start w:val="1"/>
+      <w:numFmt w:val="decimal"/>
+      <w:lvlText w:val="%8."/>
+      <w:lvlJc w:val="left"/>
+      <w:pPr>
+        <w:tabs>
+          <w:tab w:val="num" w:pos="5760"/>
+        </w:tabs>
+        <w:ind w:left="5760" w:hanging="360"/>
+      </w:pPr>
+    </w:lvl>
+    <w:lvl w:ilvl="8" w:tentative="1">
+      <w:start w:val="1"/>
+      <w:numFmt w:val="decimal"/>
+      <w:lvlText w:val="%9."/>
+      <w:lvlJc w:val="left"/>
+      <w:pPr>
+        <w:tabs>
+          <w:tab w:val="num" w:pos="6480"/>
+        </w:tabs>
+        <w:ind w:left="6480" w:hanging="360"/>
+      </w:pPr>
+    </w:lvl>
+  </w:abstractNum>
+  <w:abstractNum w:abstractNumId="18" w15:restartNumberingAfterBreak="0">
     <w:nsid w:val="4B9566C8"/>
     <w:multiLevelType w:val="hybridMultilevel"/>
     <w:tmpl w:val="0BC871BE"/>
@@ -5194,7 +8710,152 @@
       </w:pPr>
     </w:lvl>
   </w:abstractNum>
-  <w:abstractNum w:abstractNumId="14" w15:restartNumberingAfterBreak="0">
+  <w:abstractNum w:abstractNumId="19" w15:restartNumberingAfterBreak="0">
+    <w:nsid w:val="5AB63653"/>
+    <w:multiLevelType w:val="multilevel"/>
+    <w:tmpl w:val="AEBCE6B4"/>
+    <w:lvl w:ilvl="0">
+      <w:start w:val="1"/>
+      <w:numFmt w:val="bullet"/>
+      <w:lvlText w:val=""/>
+      <w:lvlJc w:val="left"/>
+      <w:pPr>
+        <w:tabs>
+          <w:tab w:val="num" w:pos="720"/>
+        </w:tabs>
+        <w:ind w:left="720" w:hanging="360"/>
+      </w:pPr>
+      <w:rPr>
+        <w:rFonts w:ascii="Symbol" w:hAnsi="Symbol" w:hint="default"/>
+        <w:sz w:val="20"/>
+      </w:rPr>
+    </w:lvl>
+    <w:lvl w:ilvl="1">
+      <w:start w:val="1"/>
+      <w:numFmt w:val="decimal"/>
+      <w:lvlText w:val="%2."/>
+      <w:lvlJc w:val="left"/>
+      <w:pPr>
+        <w:ind w:left="1440" w:hanging="360"/>
+      </w:pPr>
+      <w:rPr>
+        <w:rFonts w:hint="default"/>
+      </w:rPr>
+    </w:lvl>
+    <w:lvl w:ilvl="2" w:tentative="1">
+      <w:start w:val="1"/>
+      <w:numFmt w:val="bullet"/>
+      <w:lvlText w:val=""/>
+      <w:lvlJc w:val="left"/>
+      <w:pPr>
+        <w:tabs>
+          <w:tab w:val="num" w:pos="2160"/>
+        </w:tabs>
+        <w:ind w:left="2160" w:hanging="360"/>
+      </w:pPr>
+      <w:rPr>
+        <w:rFonts w:ascii="Wingdings" w:hAnsi="Wingdings" w:hint="default"/>
+        <w:sz w:val="20"/>
+      </w:rPr>
+    </w:lvl>
+    <w:lvl w:ilvl="3" w:tentative="1">
+      <w:start w:val="1"/>
+      <w:numFmt w:val="bullet"/>
+      <w:lvlText w:val=""/>
+      <w:lvlJc w:val="left"/>
+      <w:pPr>
+        <w:tabs>
+          <w:tab w:val="num" w:pos="2880"/>
+        </w:tabs>
+        <w:ind w:left="2880" w:hanging="360"/>
+      </w:pPr>
+      <w:rPr>
+        <w:rFonts w:ascii="Wingdings" w:hAnsi="Wingdings" w:hint="default"/>
+        <w:sz w:val="20"/>
+      </w:rPr>
+    </w:lvl>
+    <w:lvl w:ilvl="4" w:tentative="1">
+      <w:start w:val="1"/>
+      <w:numFmt w:val="bullet"/>
+      <w:lvlText w:val=""/>
+      <w:lvlJc w:val="left"/>
+      <w:pPr>
+        <w:tabs>
+          <w:tab w:val="num" w:pos="3600"/>
+        </w:tabs>
+        <w:ind w:left="3600" w:hanging="360"/>
+      </w:pPr>
+      <w:rPr>
+        <w:rFonts w:ascii="Wingdings" w:hAnsi="Wingdings" w:hint="default"/>
+        <w:sz w:val="20"/>
+      </w:rPr>
+    </w:lvl>
+    <w:lvl w:ilvl="5" w:tentative="1">
+      <w:start w:val="1"/>
+      <w:numFmt w:val="bullet"/>
+      <w:lvlText w:val=""/>
+      <w:lvlJc w:val="left"/>
+      <w:pPr>
+        <w:tabs>
+          <w:tab w:val="num" w:pos="4320"/>
+        </w:tabs>
+        <w:ind w:left="4320" w:hanging="360"/>
+      </w:pPr>
+      <w:rPr>
+        <w:rFonts w:ascii="Wingdings" w:hAnsi="Wingdings" w:hint="default"/>
+        <w:sz w:val="20"/>
+      </w:rPr>
+    </w:lvl>
+    <w:lvl w:ilvl="6" w:tentative="1">
+      <w:start w:val="1"/>
+      <w:numFmt w:val="bullet"/>
+      <w:lvlText w:val=""/>
+      <w:lvlJc w:val="left"/>
+      <w:pPr>
+        <w:tabs>
+          <w:tab w:val="num" w:pos="5040"/>
+        </w:tabs>
+        <w:ind w:left="5040" w:hanging="360"/>
+      </w:pPr>
+      <w:rPr>
+        <w:rFonts w:ascii="Wingdings" w:hAnsi="Wingdings" w:hint="default"/>
+        <w:sz w:val="20"/>
+      </w:rPr>
+    </w:lvl>
+    <w:lvl w:ilvl="7" w:tentative="1">
+      <w:start w:val="1"/>
+      <w:numFmt w:val="bullet"/>
+      <w:lvlText w:val=""/>
+      <w:lvlJc w:val="left"/>
+      <w:pPr>
+        <w:tabs>
+          <w:tab w:val="num" w:pos="5760"/>
+        </w:tabs>
+        <w:ind w:left="5760" w:hanging="360"/>
+      </w:pPr>
+      <w:rPr>
+        <w:rFonts w:ascii="Wingdings" w:hAnsi="Wingdings" w:hint="default"/>
+        <w:sz w:val="20"/>
+      </w:rPr>
+    </w:lvl>
+    <w:lvl w:ilvl="8" w:tentative="1">
+      <w:start w:val="1"/>
+      <w:numFmt w:val="bullet"/>
+      <w:lvlText w:val=""/>
+      <w:lvlJc w:val="left"/>
+      <w:pPr>
+        <w:tabs>
+          <w:tab w:val="num" w:pos="6480"/>
+        </w:tabs>
+        <w:ind w:left="6480" w:hanging="360"/>
+      </w:pPr>
+      <w:rPr>
+        <w:rFonts w:ascii="Wingdings" w:hAnsi="Wingdings" w:hint="default"/>
+        <w:sz w:val="20"/>
+      </w:rPr>
+    </w:lvl>
+  </w:abstractNum>
+  <w:abstractNum w:abstractNumId="20" w15:restartNumberingAfterBreak="0">
     <w:nsid w:val="5B0F231C"/>
     <w:multiLevelType w:val="multilevel"/>
     <w:tmpl w:val="61E06DBC"/>
@@ -5343,7 +9004,7 @@
       </w:rPr>
     </w:lvl>
   </w:abstractNum>
-  <w:abstractNum w:abstractNumId="15" w15:restartNumberingAfterBreak="0">
+  <w:abstractNum w:abstractNumId="21" w15:restartNumberingAfterBreak="0">
     <w:nsid w:val="74D43F45"/>
     <w:multiLevelType w:val="hybridMultilevel"/>
     <w:tmpl w:val="8402C9D0"/>
@@ -5432,20 +9093,169 @@
       </w:pPr>
     </w:lvl>
   </w:abstractNum>
+  <w:abstractNum w:abstractNumId="22" w15:restartNumberingAfterBreak="0">
+    <w:nsid w:val="7BF06BB8"/>
+    <w:multiLevelType w:val="multilevel"/>
+    <w:tmpl w:val="94982344"/>
+    <w:lvl w:ilvl="0">
+      <w:start w:val="1"/>
+      <w:numFmt w:val="bullet"/>
+      <w:lvlText w:val=""/>
+      <w:lvlJc w:val="left"/>
+      <w:pPr>
+        <w:tabs>
+          <w:tab w:val="num" w:pos="720"/>
+        </w:tabs>
+        <w:ind w:left="720" w:hanging="360"/>
+      </w:pPr>
+      <w:rPr>
+        <w:rFonts w:ascii="Symbol" w:hAnsi="Symbol" w:hint="default"/>
+        <w:sz w:val="20"/>
+      </w:rPr>
+    </w:lvl>
+    <w:lvl w:ilvl="1" w:tentative="1">
+      <w:start w:val="1"/>
+      <w:numFmt w:val="bullet"/>
+      <w:lvlText w:val="o"/>
+      <w:lvlJc w:val="left"/>
+      <w:pPr>
+        <w:tabs>
+          <w:tab w:val="num" w:pos="1440"/>
+        </w:tabs>
+        <w:ind w:left="1440" w:hanging="360"/>
+      </w:pPr>
+      <w:rPr>
+        <w:rFonts w:ascii="Courier New" w:hAnsi="Courier New" w:hint="default"/>
+        <w:sz w:val="20"/>
+      </w:rPr>
+    </w:lvl>
+    <w:lvl w:ilvl="2" w:tentative="1">
+      <w:start w:val="1"/>
+      <w:numFmt w:val="bullet"/>
+      <w:lvlText w:val=""/>
+      <w:lvlJc w:val="left"/>
+      <w:pPr>
+        <w:tabs>
+          <w:tab w:val="num" w:pos="2160"/>
+        </w:tabs>
+        <w:ind w:left="2160" w:hanging="360"/>
+      </w:pPr>
+      <w:rPr>
+        <w:rFonts w:ascii="Wingdings" w:hAnsi="Wingdings" w:hint="default"/>
+        <w:sz w:val="20"/>
+      </w:rPr>
+    </w:lvl>
+    <w:lvl w:ilvl="3" w:tentative="1">
+      <w:start w:val="1"/>
+      <w:numFmt w:val="bullet"/>
+      <w:lvlText w:val=""/>
+      <w:lvlJc w:val="left"/>
+      <w:pPr>
+        <w:tabs>
+          <w:tab w:val="num" w:pos="2880"/>
+        </w:tabs>
+        <w:ind w:left="2880" w:hanging="360"/>
+      </w:pPr>
+      <w:rPr>
+        <w:rFonts w:ascii="Wingdings" w:hAnsi="Wingdings" w:hint="default"/>
+        <w:sz w:val="20"/>
+      </w:rPr>
+    </w:lvl>
+    <w:lvl w:ilvl="4" w:tentative="1">
+      <w:start w:val="1"/>
+      <w:numFmt w:val="bullet"/>
+      <w:lvlText w:val=""/>
+      <w:lvlJc w:val="left"/>
+      <w:pPr>
+        <w:tabs>
+          <w:tab w:val="num" w:pos="3600"/>
+        </w:tabs>
+        <w:ind w:left="3600" w:hanging="360"/>
+      </w:pPr>
+      <w:rPr>
+        <w:rFonts w:ascii="Wingdings" w:hAnsi="Wingdings" w:hint="default"/>
+        <w:sz w:val="20"/>
+      </w:rPr>
+    </w:lvl>
+    <w:lvl w:ilvl="5" w:tentative="1">
+      <w:start w:val="1"/>
+      <w:numFmt w:val="bullet"/>
+      <w:lvlText w:val=""/>
+      <w:lvlJc w:val="left"/>
+      <w:pPr>
+        <w:tabs>
+          <w:tab w:val="num" w:pos="4320"/>
+        </w:tabs>
+        <w:ind w:left="4320" w:hanging="360"/>
+      </w:pPr>
+      <w:rPr>
+        <w:rFonts w:ascii="Wingdings" w:hAnsi="Wingdings" w:hint="default"/>
+        <w:sz w:val="20"/>
+      </w:rPr>
+    </w:lvl>
+    <w:lvl w:ilvl="6" w:tentative="1">
+      <w:start w:val="1"/>
+      <w:numFmt w:val="bullet"/>
+      <w:lvlText w:val=""/>
+      <w:lvlJc w:val="left"/>
+      <w:pPr>
+        <w:tabs>
+          <w:tab w:val="num" w:pos="5040"/>
+        </w:tabs>
+        <w:ind w:left="5040" w:hanging="360"/>
+      </w:pPr>
+      <w:rPr>
+        <w:rFonts w:ascii="Wingdings" w:hAnsi="Wingdings" w:hint="default"/>
+        <w:sz w:val="20"/>
+      </w:rPr>
+    </w:lvl>
+    <w:lvl w:ilvl="7" w:tentative="1">
+      <w:start w:val="1"/>
+      <w:numFmt w:val="bullet"/>
+      <w:lvlText w:val=""/>
+      <w:lvlJc w:val="left"/>
+      <w:pPr>
+        <w:tabs>
+          <w:tab w:val="num" w:pos="5760"/>
+        </w:tabs>
+        <w:ind w:left="5760" w:hanging="360"/>
+      </w:pPr>
+      <w:rPr>
+        <w:rFonts w:ascii="Wingdings" w:hAnsi="Wingdings" w:hint="default"/>
+        <w:sz w:val="20"/>
+      </w:rPr>
+    </w:lvl>
+    <w:lvl w:ilvl="8" w:tentative="1">
+      <w:start w:val="1"/>
+      <w:numFmt w:val="bullet"/>
+      <w:lvlText w:val=""/>
+      <w:lvlJc w:val="left"/>
+      <w:pPr>
+        <w:tabs>
+          <w:tab w:val="num" w:pos="6480"/>
+        </w:tabs>
+        <w:ind w:left="6480" w:hanging="360"/>
+      </w:pPr>
+      <w:rPr>
+        <w:rFonts w:ascii="Wingdings" w:hAnsi="Wingdings" w:hint="default"/>
+        <w:sz w:val="20"/>
+      </w:rPr>
+    </w:lvl>
+  </w:abstractNum>
   <w:num w:numId="1" w16cid:durableId="66616893">
+    <w:abstractNumId w:val="18"/>
+  </w:num>
+  <w:num w:numId="2" w16cid:durableId="123502505">
     <w:abstractNumId w:val="13"/>
   </w:num>
-  <w:num w:numId="2" w16cid:durableId="123502505">
-    <w:abstractNumId w:val="11"/>
-  </w:num>
   <w:num w:numId="3" w16cid:durableId="1535847532">
-    <w:abstractNumId w:val="15"/>
+    <w:abstractNumId w:val="21"/>
   </w:num>
   <w:num w:numId="4" w16cid:durableId="217015646">
     <w:abstractNumId w:val="0"/>
   </w:num>
   <w:num w:numId="5" w16cid:durableId="796609497">
-    <w:abstractNumId w:val="12"/>
+    <w:abstractNumId w:val="15"/>
   </w:num>
   <w:num w:numId="6" w16cid:durableId="559945052">
     <w:abstractNumId w:val="1"/>
@@ -5463,7 +9273,7 @@
     <w:abstractNumId w:val="7"/>
   </w:num>
   <w:num w:numId="11" w16cid:durableId="746851647">
-    <w:abstractNumId w:val="10"/>
+    <w:abstractNumId w:val="11"/>
   </w:num>
   <w:num w:numId="12" w16cid:durableId="1435445474">
     <w:abstractNumId w:val="8"/>
@@ -5478,7 +9288,28 @@
     <w:abstractNumId w:val="2"/>
   </w:num>
   <w:num w:numId="16" w16cid:durableId="702482787">
+    <w:abstractNumId w:val="20"/>
+  </w:num>
+  <w:num w:numId="17" w16cid:durableId="886723717">
+    <w:abstractNumId w:val="22"/>
+  </w:num>
+  <w:num w:numId="18" w16cid:durableId="554387993">
     <w:abstractNumId w:val="14"/>
+  </w:num>
+  <w:num w:numId="19" w16cid:durableId="1698238505">
+    <w:abstractNumId w:val="19"/>
+  </w:num>
+  <w:num w:numId="20" w16cid:durableId="558442085">
+    <w:abstractNumId w:val="12"/>
+  </w:num>
+  <w:num w:numId="21" w16cid:durableId="1319307368">
+    <w:abstractNumId w:val="17"/>
+  </w:num>
+  <w:num w:numId="22" w16cid:durableId="318928972">
+    <w:abstractNumId w:val="10"/>
+  </w:num>
+  <w:num w:numId="23" w16cid:durableId="1638685745">
+    <w:abstractNumId w:val="16"/>
   </w:num>
 </w:numbering>
 </file>
@@ -6406,6 +10237,35 @@
       <w:spacing w:after="0" w:line="240" w:lineRule="auto"/>
     </w:pPr>
   </w:style>
+  <w:style w:type="table" w:styleId="TableGrid">
+    <w:name w:val="Table Grid"/>
+    <w:basedOn w:val="TableNormal"/>
+    <w:uiPriority w:val="39"/>
+    <w:rsid w:val="00CA1F75"/>
+    <w:pPr>
+      <w:spacing w:after="0" w:line="240" w:lineRule="auto"/>
+    </w:pPr>
+    <w:tblPr>
+      <w:tblBorders>
+        <w:top w:val="single" w:sz="4" w:space="0" w:color="auto"/>
+        <w:left w:val="single" w:sz="4" w:space="0" w:color="auto"/>
+        <w:bottom w:val="single" w:sz="4" w:space="0" w:color="auto"/>
+        <w:right w:val="single" w:sz="4" w:space="0" w:color="auto"/>
+        <w:insideH w:val="single" w:sz="4" w:space="0" w:color="auto"/>
+        <w:insideV w:val="single" w:sz="4" w:space="0" w:color="auto"/>
+      </w:tblBorders>
+    </w:tblPr>
+  </w:style>
+  <w:style w:type="character" w:customStyle="1" w:styleId="font-semibold">
+    <w:name w:val="font-semibold"/>
+    <w:basedOn w:val="DefaultParagraphFont"/>
+    <w:rsid w:val="00CA1F75"/>
+  </w:style>
+  <w:style w:type="character" w:customStyle="1" w:styleId="max-w-180px">
+    <w:name w:val="max-w-[180px]"/>
+    <w:basedOn w:val="DefaultParagraphFont"/>
+    <w:rsid w:val="00CA1F75"/>
+  </w:style>
 </w:styles>
 </file>
 

</xml_diff>